<commit_message>
paper: final ICIIT2027_Paper with the author block in the supplied format (numbered affiliations, corresponding author); text as rev22 (10 pages)
</commit_message>
<xml_diff>
--- a/08_final_submission/ICIIT2027_Paper.docx
+++ b/08_final_submission/ICIIT2027_Paper.docx
@@ -8,7 +8,7 @@
         <w:jc w:val="center"/>
       </w:pPr>
       <w:r>
-        <w:t>From Forecasts to Decisions: Benchmarking Probabilistic Demand Forecasts for Retail Replenishment and Liquidation Across Settings and Periods</w:t>
+        <w:t>Beyond Forecast Accuracy: Comparing Probabilistic Demand Forecasts by the Inventory They Require across Retail Settings and Periods</w:t>
       </w:r>
     </w:p>
     <w:p>
@@ -17,7 +17,60 @@
         <w:jc w:val="center"/>
       </w:pPr>
       <w:r>
-        <w:t>[AUTHOR NAMES TO BE ADDED]</w:t>
+        <w:rPr/>
+        <w:t>Duy Anh Bui</w:t>
+      </w:r>
+      <w:r>
+        <w:rPr>
+          <w:vertAlign w:val="superscript"/>
+        </w:rPr>
+        <w:t>1</w:t>
+      </w:r>
+      <w:r>
+        <w:rPr/>
+        <w:t xml:space="preserve">, </w:t>
+      </w:r>
+      <w:r>
+        <w:rPr/>
+        <w:t>Huy Gia Tran Khong</w:t>
+      </w:r>
+      <w:r>
+        <w:rPr>
+          <w:vertAlign w:val="superscript"/>
+        </w:rPr>
+        <w:t>1</w:t>
+      </w:r>
+      <w:r>
+        <w:rPr/>
+        <w:t xml:space="preserve">, </w:t>
+      </w:r>
+      <w:r>
+        <w:rPr/>
+        <w:t>Huong Cam Thi Nguyen</w:t>
+      </w:r>
+      <w:r>
+        <w:rPr>
+          <w:vertAlign w:val="superscript"/>
+        </w:rPr>
+        <w:t>1</w:t>
+      </w:r>
+      <w:r>
+        <w:rPr/>
+        <w:t xml:space="preserve">, </w:t>
+      </w:r>
+      <w:r>
+        <w:rPr/>
+        <w:t xml:space="preserve">and </w:t>
+      </w:r>
+      <w:r>
+        <w:rPr/>
+        <w:t>Long Truong</w:t>
+      </w:r>
+      <w:r>
+        <w:rPr>
+          <w:vertAlign w:val="superscript"/>
+        </w:rPr>
+        <w:t>1*</w:t>
       </w:r>
     </w:p>
     <w:p>
@@ -26,12 +79,32 @@
         <w:jc w:val="center"/>
       </w:pPr>
       <w:r>
-        <w:t>[Affiliation, city, country, e-mail — to be added]</w:t>
+        <w:rPr>
+          <w:vertAlign w:val="superscript"/>
+        </w:rPr>
+        <w:t>1</w:t>
+      </w:r>
+      <w:r>
+        <w:rPr/>
+        <w:t xml:space="preserve"> FPT University, Ho Chi Minh City, Vietnam</w:t>
+      </w:r>
+    </w:p>
+    <w:p>
+      <w:pPr>
+        <w:pStyle w:val="SmallNote"/>
+        <w:jc w:val="center"/>
+      </w:pPr>
+      <w:r>
+        <w:rPr>
+          <w:rFonts w:ascii="Courier New" w:hAnsi="Courier New"/>
+        </w:rPr>
+        <w:t>longt5@fpt.edu.vn</w:t>
       </w:r>
     </w:p>
     <w:p>
       <w:pPr>
         <w:pStyle w:val="Heading1"/>
+        <w:keepNext/>
       </w:pPr>
       <w:r>
         <w:t>ABSTRACT</w:t>
@@ -40,9 +113,10 @@
     <w:p>
       <w:pPr>
         <w:pStyle w:val="AbstractText"/>
+        <w:widowControl/>
       </w:pPr>
       <w:r>
-        <w:t>Public retail forecasting benchmarks primarily measure forecast error, although forecasts also determine replenishment quantities. We compare seven probabilistic forecasting methods—three statistical methods and four gradient-boosting approaches—under a common order-up-to policy with optional liquidation. Experiments cover all eligible series in two public datasets, M5 (physical retail) and VN1 (multi-vendor e-commerce), across three 26-week test windows. Neither dataset provides inventory costs, so replenishment methods are compared by inventory requirements at the same realised fill rate, with confidence intervals obtained by bootstrap resampling. On M5, LightGBM quantile regression (LGB-Q) has the lowest volume-weighted quantile loss and requires 3–11% less inventory than point forecasts with safety stock, conformal quantiles, TSB-NB, and exponential smoothing at a fill rate of 0.94 in all three windows. On VN1, the most inventory-efficient method varies by window. For series with stable demand, TSB-NB requires 13–16% less inventory than LGB-Q; for growing-demand series, TSB-NB cannot attain a fill rate of 0.92 in two windows, whereas LGB-Q can. Neither ADI–CV² classes nor the tested unsupervised segmentation consistently improve method selection. In a post hoc analysis, an equal-weight average of LGB-Q and TSB-NB quantiles requires 6–11% less inventory than LGB-Q on VN1 at a fill rate of 0.92 and remains within 1.5% on M5; its worst-case regret across the six runs is 0.9%, compared with 9.4% for LGB-Q. The combination requires independent validation. Quantile-based liquidation changes fill rates by no more than 0.02 percentage points, but no liquidation policy shows a consistent economic benefit under the assumed costs over 26 weeks.</w:t>
+        <w:t>The forecast with the lowest error is not necessarily the forecast that supports the lowest inventory. We test this using seven probabilistic forecasting methods—three statistical and four gradient-boosting approaches—in a weekly order-up-to simulation with optional liquidation, on all eligible series from M5 (physical stores) and VN1 (multi-vendor e-commerce) over three 26-week windows per dataset. Because inventory costs are unobserved, we compare stock at equal realised fill rates with bootstrap confidence intervals. On M5, LightGBM quantile regression (LGB-Q) has the lowest volume-weighted quantile loss and, at a fill rate of 0.94, needs 3–11% less inventory than the safety-stock, conformal, TSB-NB and exponential-smoothing alternatives in each window; this holds across tested lead times and LightGBM settings. VN1 ranks the methods differently in different windows: TSB-NB needs 13–16% less inventory for series that turn out to be stable but fails to reach a fill rate of 0.92 on growing-demand series in two windows, and neither ADI–CV² classes nor clusters consistently identify the right method in advance. A median of all seven methods' quantiles, specified before testing, needs 7–8% less VN1 inventory than LGB-Q at a fill rate of 0.92, but the saving loses significance when warehouses are resampled, does not persist when τ is calibrated from past weeks only, and is not confirmed on an independent footwear dataset, where neither combination demonstrates a statistically significant inventory advantage over LGB-Q. Quantile-based liquidation changes fill rate by at most 0.02 percentage points but shows no consistent economic advantage over 26 weeks under the assumed costs.</w:t>
       </w:r>
     </w:p>
     <w:p>
@@ -66,82 +140,130 @@
         <w:pStyle w:val="SmallNote"/>
       </w:pPr>
       <w:r>
-        <w:t>ACM Reference Format: [Author names to be added]. 2027. From Forecasts to Decisions: Benchmarking Probabilistic Demand Forecasts for Retail Replenishment and Liquidation Across Settings and Periods. In Proceedings of the 12th International Conference on Intelligent Information Technology (ICIIT 2027). ACM, New York, NY, USA.</w:t>
+        <w:t>ACM Reference Format: Duy Anh Bui, Huy Gia Tran Khong, Huong Cam Thi Nguyen, and Long Truong. 2027. Beyond Forecast Accuracy: Comparing Probabilistic Demand Forecasts by the Inventory They Require across Retail Settings and Periods. In Proceedings of the 12th International Conference on Intelligent Information Technology (ICIIT 2027). ACM, New York, NY, USA.</w:t>
       </w:r>
     </w:p>
     <w:p>
       <w:pPr>
         <w:pStyle w:val="Heading1"/>
+        <w:keepNext/>
       </w:pPr>
       <w:r>
         <w:t>1  INTRODUCTION</w:t>
       </w:r>
     </w:p>
     <w:p>
-      <w:pPr/>
+      <w:pPr>
+        <w:widowControl/>
+      </w:pPr>
       <w:r>
-        <w:t>Insufficient stock leads to lost sales, while excess stock increases holding requirements and may eventually require liquidation. Inventory decisions therefore depend on the distribution of future demand rather than its point estimate alone. Quantile forecasts provide inputs for replenishment decisions at specified service targets [3].</w:t>
+        <w:t>Forecasting benchmarks rank models by predictive error, but retailers choose forecasts to support inventory decisions, and the two rankings need not agree. An order based on the expected value of demand cannot describe the risk of a stockout: insufficient inventory loses sales, while excess stock incurs holding costs and may later be liquidated. Forecast quantiles allow an order-up-to level to be set for a chosen service target [3], but whether they are statistically accurate is a separate question from how much stock their use requires.</w:t>
       </w:r>
     </w:p>
     <w:p>
-      <w:pPr/>
+      <w:pPr>
+        <w:widowControl/>
+      </w:pPr>
       <w:r>
-        <w:t>Public forecasting benchmarks primarily assess prediction accuracy. The M5 competition evaluated weighted RMSSE and weighted scaled pinball loss [1], and its organisers did not define a particular downstream decision problem [3]. Evaluations of the VN1 e-commerce dataset have likewise addressed forecast accuracy and computational cost [4]. These metrics do not necessarily rank methods by inventory performance [5, 6, 23]. Using M5, Theodorou et al. [7] show that accuracy rankings and inventory-cost rankings can diverge, particularly when lost sales are expensive and demand is intermittent. They also call for evaluation on online retail data.</w:t>
+        <w:t>The difference matters when selecting a forecasting method. M5 ranks forecasts using weighted RMSSE and weighted scaled pinball loss [1]; its uncertainty track was not designed around an inventory decision [3]. Work with VN1 has likewise focused on accuracy and computation [4]. Inventory simulations can yield a different ranking [5, 6, 23]. In particular, Theodorou et al. [7] report discrepancies on M5 when lost sales are costly, especially for intermittent series. They identify online retail as a setting in need of further testing.</w:t>
       </w:r>
     </w:p>
     <w:p>
-      <w:pPr/>
+      <w:pPr>
+        <w:widowControl/>
+      </w:pPr>
       <w:r>
-        <w:t>Several aspects remain insufficiently tested. M5 inventory studies often evaluate selected subsets, including 8,000 high-volume series [8], volatile food products [9], or series with at least 2.5 years of history [7]. Such filters exclude some low-volume and intermittent series. Existing studies also commonly use a single dataset and test period [5, 7–9, 23], leaving variation across retail settings and periods less well documented. Finally, public datasets lack observed inventory positions and unit costs. Cost-based assessments must therefore assume these quantities, and conclusions can depend on the assumed cost structure [7].</w:t>
+        <w:t>Three features of the existing evidence motivate our design. First, M5 inventory evaluations have used selected subsets: 8,000 high-volume series [8], volatile food products [9], or series with at least 2.5 years of history [7]. These restrictions leave some sparse series outside the analysis. Second, most comparisons use a single dataset and test period [5, 7–9, 23], so period-to-period variation is poorly characterised. Third, public sales panels do not provide historical inventory positions or unit costs. Any simulated monetary outcome must consequently depend on assumptions about those missing quantities [7].</w:t>
       </w:r>
     </w:p>
     <w:p>
-      <w:pPr/>
+      <w:pPr>
+        <w:widowControl/>
+      </w:pPr>
       <w:r>
-        <w:t>We evaluate probabilistic forecasting methods by simulating their replenishment and liquidation decisions under a common policy; no new forecasting model is proposed. Specifically, this study (1) compares seven forecasting methods on all eligible series in two retail datasets using a CPU-based experimental pipeline; (2) assesses replenishment at equal realised fill rates with bootstrap confidence intervals, and reports break-even salvage ratios for liquidation; (3) repeats the experiments across three 26-week windows per dataset; (4) examines how observed demand changes relate to rankings on VN1 and tests pre-test demand groupings for method selection; and (5) evaluates, post hoc, an equal-weight combination of the LGB-Q and TSB-NB quantiles. The last analysis is exploratory rather than an independently validated selection rule.</w:t>
+        <w:t>We hold the inventory policy fixed and vary only its demand forecasts, evaluating seven methods on every eligible series of M5 and VN1 over three 26-week windows each. We ask two questions. RQ1: do rankings by forecast accuracy and by the inventory needed for a given realised fill rate agree across retail settings and periods? RQ2: do inventory savings measured at matched realised fill survive deployment-style evaluation, with service calibrated from past weeks only and an independent panel? Our contributions are as follows.</w:t>
+      </w:r>
+    </w:p>
+    <w:p>
+      <w:pPr>
+        <w:widowControl/>
+        <w:ind w:left="280" w:hanging="200"/>
+      </w:pPr>
+      <w:r>
+        <w:t>•  Ranking agreement depends on the setting and the period (RQ1). On M5, LGB-Q is both the most accurate method and needs 3–11% less stock than the point-forecast, conformal, TSB-NB and exponential-smoothing alternatives in every window; on VN1 the leading method changes between windows, and neither demand classes, clusters nor pre-test warehouse features select it reliably in advance.</w:t>
+      </w:r>
+    </w:p>
+    <w:p>
+      <w:pPr>
+        <w:widowControl/>
+        <w:ind w:left="280" w:hanging="200"/>
+      </w:pPr>
+      <w:r>
+        <w:t>•  Retrospective savings are not prospective evidence (RQ2). The 7–8% VN1 saving of a pre-specified seven-method median at matched realised fill is not confirmed under past-only calibration, full-policy cluster bootstraps and an independent footwear panel, whereas the M5 ranking holds; prospective inventory comparisons report achieved fill alongside stock requirements.</w:t>
+      </w:r>
+    </w:p>
+    <w:p>
+      <w:pPr>
+        <w:widowControl/>
+        <w:ind w:left="280" w:hanging="200"/>
+      </w:pPr>
+      <w:r>
+        <w:t>•  Supporting results. Checks on lead time, hyperparameters, censored demand and computing cost show which findings are stable, a break-even salvage ratio states when liquidation pays, and code and results are public.</w:t>
       </w:r>
     </w:p>
     <w:p>
       <w:pPr>
         <w:pStyle w:val="Heading1"/>
+        <w:keepNext/>
       </w:pPr>
       <w:r>
         <w:t>2  RELATED WORK</w:t>
       </w:r>
     </w:p>
     <w:p>
-      <w:pPr/>
+      <w:pPr>
+        <w:widowControl/>
+      </w:pPr>
       <w:r>
-        <w:t>Retail forecasting benchmarks. LightGBM was used by all top 50 teams in the M5 accuracy track, and the winning solution combined LightGBM models fitted with a Tweedie loss [2]. The leading uncertainty-track solution trained distinct LightGBM models for the forecast quantiles [3]. These approaches inform our direct-quantile and point-forecast baselines. Zanotti [4] analysed the computational and forecast-accuracy effects of combining global models on M5 and VN1, without simulating inventory decisions.</w:t>
+        <w:t>Retail forecasting benchmarks. In M5's accuracy track, all 50 highest-ranked teams used LightGBM, and the winning entry combined models fitted with Tweedie loss [2]. The leading uncertainty-track entry trained a separate LightGBM model for each quantile [3]. We therefore include both point-based and directly estimated quantiles. Zanotti [4] compared global-model ensembles on M5 and VN1 in terms of forecast accuracy and computing cost, without simulating stock decisions.</w:t>
       </w:r>
     </w:p>
     <w:p>
-      <w:pPr/>
+      <w:pPr>
+        <w:widowControl/>
+      </w:pPr>
       <w:r>
-        <w:t>Intermittent demand. Teunter, Syntetos, and Babai (TSB) update the probability of non-zero demand each period to respond to potential obsolescence [10]. The average inter-demand interval (ADI) and squared coefficient of variation of demand size (CV²) are standard descriptors of intermittency [11]; ADI = 4/3 and CV² = 0.5 define the class boundaries used for M5 [1]. Damato et al. [12] compared local and global probabilistic methods on intermittent series and found no single established global architecture for this setting.</w:t>
+        <w:t>Intermittent demand. TSB updates the probability of non-zero demand from one period to the next, allowing the forecast to decline when sales stop [10]. Average inter-demand interval (ADI) and squared coefficient of variation of positive demand sizes (CV²) are conventional descriptions of demand intermittency [11]. For M5 we use class boundaries ADI = 4/3 and CV² = 0.5 [1]. Damato et al. [12] found no established global-model architecture that dominates on intermittent data.</w:t>
       </w:r>
     </w:p>
     <w:p>
-      <w:pPr/>
+      <w:pPr>
+        <w:widowControl/>
+      </w:pPr>
       <w:r>
-        <w:t>Forecasts and inventory decisions. Goltsos et al. [6] report that forecast evaluation often omits the subsequent replenishment decision. Kourentzes et al. [13] optimise exponential smoothing against an inventory-oriented criterion, while van der Haar et al. [14] estimate order quantities directly. Petropoulos et al. [24] simulated an order-up-to policy using rolling forecast origins on M3 series and found benefits from forecast combinations. On M5, Spiliotis et al. [23] evaluated a 28-day daily-review simulation and found that simple empirical quantiles could outperform machine-learning approaches in inventory terms. Wang et al. [5] investigated probabilistic combinations under a single-period newsvendor formulation. Zabraoui et al. [9] simulated reinforcement-learning inventory policies for selected products, and Mohammed et al. [8] assessed safety stock with an illustrative cost calculation on high-volume series.</w:t>
+        <w:t>Forecasts used for inventory. Goltsos et al. [6] document the frequent separation of forecasting studies from the replenishment decisions they inform. Kourentzes et al. [13] fit exponential smoothing with an inventory-based criterion; van der Haar et al. [14] estimate order quantities directly. On M3 series, Petropoulos et al. [24] found forecast combinations effective in a rolling order-up-to simulation. Evidence from M5 is mixed: simple empirical quantiles perform well in the 28-day daily-review experiment of Spiliotis et al. [23]; Wang et al. [5] study forecast combinations with a single-period newsvendor; Zabraoui et al. [9] apply reinforcement-learning stock policies to selected products; and Mohammed et al. [8] evaluate safety stock for high-volume series with an illustrative cost calculation.</w:t>
       </w:r>
     </w:p>
     <w:p>
-      <w:pPr/>
+      <w:pPr>
+        <w:widowControl/>
+      </w:pPr>
       <w:r>
-        <w:t>Theodorou et al. [7] provide the closest comparison. Their study simulates one year of lost-sales inventory control for 7,783 daily M5 product–state series, 13 forecasting methods, and 24 combinations of service target, review period, and lead time. Forecast quantiles are generated from point predictions and empirical residual quantiles. Their trade-off curves are broadly aligned with accuracy, whereas costs that penalise lost sales more heavily can favour less accurate models.</w:t>
+        <w:t>Theodorou et al. [7] are the closest point of comparison. They simulate lost-sales inventory control for one year on 7,783 daily M5 product–state series. Their design covers 13 forecasting methods and 24 service-target, review-period and lead-time combinations. Quantiles are constructed from point forecasts and past forecast errors. Although error and inventory trade-off curves generally align, inventory-cost rankings can favour less accurate methods when stockouts carry a high penalty.</w:t>
       </w:r>
     </w:p>
     <w:p>
-      <w:pPr/>
+      <w:pPr>
+        <w:widowControl/>
+      </w:pPr>
       <w:r>
-        <w:t>Our comparison extends the decision-oriented evaluation to two retail settings, all eligible demand classes, a liquidation decision, and three test windows. We also include directly estimated quantiles and compare the inventory required to achieve the same realised fill rate. This differs from comparing methods at a common nominal service target, which can produce different realised fill rates [7]. Multi-period inventory simulation and decision-based evaluation themselves have been studied previously [5, 7, 9, 14].</w:t>
+        <w:t>We retain eligible series across demand classes, use two retail settings with three test windows plus an independent third panel, and include a liquidation decision. We also estimate quantiles directly rather than deriving all of them from residuals. Inventory is compared at the same realised fill rate, because a common nominal quantile level does not give all methods the same achieved service [7]. Neither multi-period stock simulation nor decision-based forecast evaluation is new [5, 7, 9, 14]. Unlike [7], which evaluates one 365-day period at product–state level, and [5], which tunes combinations for a single-period newsvendor on one 28-day holdout, we compare rankings across settings and periods and test whether retrospective savings survive prospective evaluation.</w:t>
       </w:r>
     </w:p>
     <w:p>
       <w:pPr>
         <w:pStyle w:val="Heading1"/>
+        <w:keepNext/>
       </w:pPr>
       <w:r>
         <w:t>3  METHOD</w:t>
@@ -150,23 +272,28 @@
     <w:p>
       <w:pPr>
         <w:pStyle w:val="Heading2"/>
+        <w:keepNext/>
       </w:pPr>
       <w:r>
         <w:t>3.1  Data</w:t>
       </w:r>
     </w:p>
     <w:p>
-      <w:pPr/>
+      <w:pPr>
+        <w:widowControl/>
+      </w:pPr>
       <w:r>
-        <w:t>The M5 dataset [1] records daily unit sales for 3,049 products at 10 Walmart stores, producing 30,490 product–store series. We aggregate daily observations into 277 complete weeks. VN1 [21] comprises 15,053 client–warehouse–product series over 196 weeks and represents multi-vendor e-commerce; its name does not indicate a Vietnamese dataset. A series is eligible for a given test window if its first observation precedes the window by at least 13 weeks and it has at least one sale before the window.</w:t>
+        <w:t>M5 [1] reports daily unit sales for 3,049 products in 10 Walmart stores, giving 30,490 product–store series. Aggregating complete weeks yields 277 weekly observations. VN1 [21] contains 15,053 client–warehouse–product series spanning 196 weeks of multi-vendor e-commerce sales; despite its name, the dataset is not from Vietnam. Eligibility is determined separately for each test window: a series must start at least 13 weeks before that window and record at least one earlier sale.</w:t>
       </w:r>
     </w:p>
     <w:p>
       <w:pPr>
         <w:pStyle w:val="TableCaption"/>
+        <w:keepNext/>
+        <w:spacing w:before="80" w:after="60"/>
       </w:pPr>
       <w:r>
-        <w:t>Table 1. Dataset properties. Demand classes and zero-week shares are calculated from histories preceding the main test window.</w:t>
+        <w:t>Table 1. Dataset characteristics measured before the main test window.</w:t>
       </w:r>
     </w:p>
     <w:tbl>
@@ -185,6 +312,7 @@
       <w:tr>
         <w:trPr>
           <w:tblHeader w:val="true"/>
+          <w:tblHeader w:val="true"/>
         </w:trPr>
         <w:tc>
           <w:tcPr>
@@ -809,154 +937,193 @@
     </w:tbl>
     <w:p>
       <w:pPr>
+        <w:widowControl/>
         <w:spacing w:after="0" w:before="0"/>
       </w:pPr>
     </w:p>
     <w:p>
-      <w:pPr/>
+      <w:pPr>
+        <w:widowControl/>
+      </w:pPr>
       <w:r>
-        <w:t>Both datasets are processed by the same code. The definition of series start differs between the two source datasets, although the resulting start dates coincide for 99.5% of M5 series. The demand distributions also differ: a classifier using nine demand characteristics distinguishes the datasets with an AUC of 0.91 (Section 5.7).</w:t>
+        <w:t>A single processing pipeline handles both panels. The source data differ in the definition of a series start, but the resulting dates agree for 99.5% of M5 series. Their demand characteristics are nonetheless distinct (Table 1): a classifier using nine demand features identifies the dataset with an AUC of 0.91 (repository); Section 5.7 tests whether such differences explain the results.</w:t>
+      </w:r>
+    </w:p>
+    <w:p>
+      <w:pPr>
+        <w:widowControl/>
+      </w:pPr>
+      <w:r>
+        <w:t>Independent panel. To check the combinations on data not used to specify them, we add the retail-channel sales of a Vietnamese footwear chain, public on Kaggle (tienanh2003/sales-and-inventory-snapshot-data): 1,001 style–colour series over 82 weeks (January 2022 to July 2023), excluding returns and three partial weeks. With the eligibility rule above, 909 series enter one 26-week test window from 30 January 2023. Forecasts use the same pipeline, 21 features, refit schedule and policy; rerunning it on the processed sales file reproduces them exactly. Only one window fits the short history, month-end stock snapshots are unused, and single-method results on this panel existed before, but were not used for, specifying the combinations.</w:t>
       </w:r>
     </w:p>
     <w:p>
       <w:pPr>
         <w:pStyle w:val="Heading2"/>
+        <w:keepNext/>
       </w:pPr>
       <w:r>
         <w:t>3.2  Forecast targets and methods</w:t>
       </w:r>
     </w:p>
     <w:p>
-      <w:pPr/>
+      <w:pPr>
+        <w:widowControl/>
+      </w:pPr>
       <w:r>
-        <w:t>At each weekly forecast origin, the methods predict quantiles q ∈ {0.50, 0.80, 0.90, 0.95, 0.99} of cumulative demand over h weeks. We use h = 3 for replenishment and h = 13 for liquidation. Each cumulative-demand quantile is estimated directly rather than obtained by adding weekly quantiles, since quantiles are not additive.</w:t>
+        <w:t>Each week, we predict quantiles q ∈ {0.50, 0.80, 0.90, 0.95, 0.99} of demand accumulated over horizon h. Replenishment uses h = 3 weeks and liquidation h = 13 weeks. Quantiles are fitted to cumulative demand rather than obtained by summing separate weekly quantiles, which would generally be incorrect.</w:t>
       </w:r>
     </w:p>
     <w:p>
       <w:pPr>
+        <w:widowControl/>
         <w:ind w:left="202"/>
       </w:pPr>
       <w:r>
-        <w:t>EMP: empirical quantiles of rolling h-week cumulative demand from the preceding 104 weeks.</w:t>
+        <w:t>EMP: empirical quantiles of rolling h-week demand totals observed during the preceding 104 weeks.</w:t>
       </w:r>
     </w:p>
     <w:p>
       <w:pPr>
+        <w:widowControl/>
         <w:ind w:left="202"/>
       </w:pPr>
       <w:r>
-        <w:t>ETS: simple exponential smoothing, with a normal approximation to cumulative demand over h weeks [18].</w:t>
+        <w:t>ETS: simple exponential smoothing and a normal approximation for the h-week demand total [18].</w:t>
       </w:r>
     </w:p>
     <w:p>
       <w:pPr>
+        <w:widowControl/>
         <w:ind w:left="202"/>
       </w:pPr>
       <w:r>
-        <w:t>TSB-NB: the TSB approach [10] with a negative-binomial predictive distribution [25] matched to the estimated mean and variance of cumulative demand.</w:t>
+        <w:t>TSB-NB: TSB [10] with a negative-binomial predictive distribution [25], matched to the estimated mean and variance of h-week demand.</w:t>
       </w:r>
     </w:p>
     <w:p>
       <w:pPr>
+        <w:widowControl/>
         <w:ind w:left="202"/>
       </w:pPr>
       <w:r>
-        <w:t>LGB-T: a global LightGBM point forecast using a Tweedie loss [15], combined with a normal safety-stock adjustment estimated from series-level validation residuals.</w:t>
+        <w:t>LGB-T: a global LightGBM point model fitted with Tweedie loss [15], with a normal safety-stock adjustment derived from validation residuals for each series.</w:t>
       </w:r>
     </w:p>
     <w:p>
       <w:pPr>
+        <w:widowControl/>
         <w:ind w:left="202"/>
       </w:pPr>
       <w:r>
-        <w:t>LGB-C: the same LightGBM point model combined with split-conformal quantiles [17], using residuals pooled by demand class.</w:t>
+        <w:t>LGB-C: the same point model, with split-conformal quantiles [17] based on residuals pooled within demand classes.</w:t>
       </w:r>
     </w:p>
     <w:p>
       <w:pPr>
+        <w:widowControl/>
         <w:ind w:left="202"/>
       </w:pPr>
       <w:r>
-        <w:t>HGB-Q: histogram gradient boosting [19] trained with quantile loss on a 300,000-row sample, providing a separate implementation for comparison with LightGBM quantile regression.</w:t>
+        <w:t>HGB-Q: histogram gradient boosting [19] fitted with quantile loss to 300,000 sampled training rows. It provides a second direct-quantile implementation.</w:t>
       </w:r>
     </w:p>
     <w:p>
       <w:pPr>
+        <w:widowControl/>
         <w:ind w:left="202"/>
       </w:pPr>
       <w:r>
-        <w:t>LGB-Q: LightGBM quantile regression [16] with one global model per quantile; the main forecasting model in this study.</w:t>
+        <w:t>LGB-Q: LightGBM quantile regression [16], fitting a separate global model for each quantile.</w:t>
       </w:r>
     </w:p>
     <w:p>
-      <w:pPr/>
+      <w:pPr>
+        <w:widowControl/>
+      </w:pPr>
       <w:r>
-        <w:t>Section 5.5 additionally examines C2, the arithmetic mean of corresponding LGB-Q and TSB-NB quantiles. The four global gradient-boosting models use common features: lagged sales, rolling means and standard deviations, zero-demand share, weeks since the last sale, calendar variables, price, and series scale. Targets are scaled by the series level. The M5 models also use events, SNAP days, and product hierarchy. Hyperparameters are held fixed; the models are not tuned for these experiments.</w:t>
+        <w:t>An additional combination, C2, specified post hoc after inspecting the results, averages the corresponding LGB-Q and TSB-NB quantiles (Section 5.5). That section also evaluates two combinations of all seven methods fixed before they were run: the mean (E7) and the median (E7-med) of their quantiles. All four global gradient-boosting methods have the same input categories: sales lags, rolling mean and variation, proportion of zero-sales weeks, time since last sale, calendar terms, price and series scale. Targets are scaled to the series level. M5 additionally supplies events, SNAP days and product hierarchy. No hyperparameter search is performed. LGB-Q, LGB-T and LGB-C share one LightGBM configuration: learning rate 0.05, 63 leaves with no depth limit, at least 200 samples per leaf, L2 penalty 1, feature and row subsampling fractions of 0.8, and at most 1,000 boosting rounds with early stopping after 50 rounds. Each refit trains on up to 104 weekly origins and validates on the following 13; LGB-T and LGB-C use Tweedie loss with variance power 1.1. HGB-Q uses learning rate 0.1, at most 300 iterations, 63 leaves and at least 200 samples per leaf. Sensitivity checks appear in Section 5.8.</w:t>
       </w:r>
     </w:p>
     <w:p>
       <w:pPr>
         <w:pStyle w:val="Heading2"/>
+        <w:keepNext/>
       </w:pPr>
       <w:r>
         <w:t>3.3  Inventory decision policy</w:t>
       </w:r>
     </w:p>
     <w:p>
-      <w:pPr/>
+      <w:pPr>
+        <w:widowControl/>
+      </w:pPr>
       <w:r>
-        <w:t>Inventory is simulated separately for each series with weekly review and lost sales. In each week: (1) orders placed L weeks earlier arrive; (2) inventory position IP is computed as on-hand plus on-order units; (3) units above the liquidation threshold T are liquidated, where applicable; (4) the policy orders max(S − IP, 0), with S equal to the τ-quantile of demand over L + 1 weeks, unless liquidation has occurred; and (5) demand is realised, with unsatisfied units counted as lost sales. The default lead time is L = 2 weeks.</w:t>
+        <w:t>We simulate weekly review with a separate lost-sales inventory process for each series. At the start of a week, orders from L weeks earlier arrive. Inventory position IP includes on-hand and outstanding units. If liquidation applies, stock above threshold T is removed. The replenishment order is max(S − IP, 0), where S is the τ-quantile of demand over L + 1 weeks; no new order is placed in a week with liquidation. Demand then occurs, and any unmet units are recorded as lost sales. Unless otherwise stated, L = 2 weeks.</w:t>
       </w:r>
     </w:p>
     <w:p>
-      <w:pPr/>
+      <w:pPr>
+        <w:widowControl/>
+      </w:pPr>
       <w:r>
-        <w:t>Four liquidation policies are compared using the same replenishment forecasts: no liquidation; quantile liquidation, where T is the method’s 0.95-quantile of 13-week cumulative demand; fixed liquidation, where T equals 26 times the mean weekly sales over the preceding 26 weeks; and dead13, where a series with no sale for 13 weeks is completely liquidated and replenishment is suspended until the series records another sale.</w:t>
+        <w:t>Four policies share the replenishment forecasts: no liquidation; quantile liquidation, with T set to the method's 0.95-quantile of 13-week demand; a fixed threshold of 26 times mean weekly sales in the preceding 26 weeks; and dead13, which removes all stock after 13 consecutive weeks without sales and suspends ordering until a new sale is recorded.</w:t>
       </w:r>
     </w:p>
     <w:p>
       <w:pPr>
         <w:pStyle w:val="Heading2"/>
+        <w:keepNext/>
       </w:pPr>
       <w:r>
         <w:t>3.4  Evaluation metrics</w:t>
       </w:r>
     </w:p>
     <w:p>
-      <w:pPr/>
+      <w:pPr>
+        <w:widowControl/>
+      </w:pPr>
       <w:r>
-        <w:t>Forecast accuracy. The conventional per-series scaled quantile loss divides pinball loss by the in-sample naïve forecast error. Its cross-series mean is unstable on VN1 (Section 5.1). We therefore report volume-weighted quantile loss (wQL), calculated as total pinball loss divided by total demand, as well as the median per-series scaled loss. Mean per-series method ranks are compared using the Friedman test and the Nemenyi critical difference [20].</w:t>
+        <w:t>Forecast accuracy. For a series, scaled quantile loss divides pinball loss by the in-sample naïve forecast error. A small denominator makes its cross-series mean unstable on VN1 (Section 5.1). We therefore report volume-weighted quantile loss (wQL: total pinball loss divided by total demand), the median series-level scaled loss, and the mean rank of each method across series. Rank differences are evaluated with the Friedman test and Nemenyi critical difference [20].</w:t>
       </w:r>
     </w:p>
     <w:p>
-      <w:pPr/>
+      <w:pPr>
+        <w:widowControl/>
+      </w:pPr>
       <w:r>
-        <w:t>Inventory performance. Inventory and fill rates are measured over 22 weeks after a four-week warm-up within each test window. Fill rate equals units sold divided by units demanded; inventory is expressed in weeks of demand. Because the methods reach different fill rates at the same target quantile τ, we evaluate τ at each of the five quantile levels and interpolate the inventory required to reach a specified realised fill rate along the inventory–fill-rate curves [7, 25]. Frontier rank is the mean rank of required inventory across fill-rate targets from 0.90 to 0.98. Confidence intervals are computed using 200 bootstrap resamples of series; they quantify cross-series sampling variation, not uncertainty over future time periods.</w:t>
+        <w:t>Inventory. Each 26-week window starts with a four-week warm-up, leaving 22 weeks for evaluation. Fill rate is the fraction of demanded units sold; inventory is measured in weeks of demand. We vary the order-up-to quantile level τ over the five reported values, then interpolate along each inventory–fill-rate curve to find the stock required at a specified realised fill rate [7, 25]. A method's frontier rank is its mean inventory rank across fill targets of 0.90–0.98. The 200 series-level bootstrap resamples reflect uncertainty across series, not uncertainty about performance in future periods.</w:t>
       </w:r>
     </w:p>
     <w:p>
-      <w:pPr/>
+      <w:pPr>
+        <w:widowControl/>
+      </w:pPr>
       <w:r>
-        <w:t>Liquidation. For each policy, we calculate the break-even salvage ratio s*: the minimum resale or salvage price, as a fraction of unit purchase cost, for which liquidation is at least as profitable as retaining inventory under the assumed costs. The sensitivity analysis uses annual holding-cost rates of 10–40% and gross margins of 30–100%. The datasets contain no observed inventory-cost or salvage-price records.</w:t>
+        <w:t>Liquidation. For each policy we simulate each series twice from the same starting stock, with and without liquidation, and write Δ for the difference between the two runs over the test window. With unit cost normalised to 1, ΔO is the change in units ordered, ΔS the change in units sold, ΔI the change in inventory (unit-weeks), ΔE the change in the end-of-horizon position (on-hand plus on-order units, valued at cost) and Q the number of units liquidated. With weekly holding rate h (annual rate / 52) and markup m (selling price (1 + m) times cost), liquidating at salvage ratio s is at least as profitable as holding when s·Q + (1 + m)·ΔS − ΔO − h·ΔI + ΔE ≥ 0. The break-even salvage ratio is therefore s* = [ΔO − ΔE + h·ΔI − (1 + m)·ΔS] / Q. A value s* &lt; 1 means that liquidating below cost still pays off; s* &gt; 1 means that liquidation pays off only if stock can be sold above cost. Valuing the end position at cost favours holding, so the reported s* is an upper bound. Calculations cover annual holding costs of 10–40% and markups of 30–100%. Neither actual salvage prices nor inventory costs are observed in these datasets.</w:t>
       </w:r>
     </w:p>
     <w:p>
       <w:pPr>
         <w:pStyle w:val="Heading1"/>
+        <w:keepNext/>
       </w:pPr>
       <w:r>
         <w:t>4  EXPERIMENTAL SETUP</w:t>
       </w:r>
     </w:p>
     <w:p>
-      <w:pPr/>
+      <w:pPr>
+        <w:widowControl/>
+      </w:pPr>
       <w:r>
-        <w:t>Each dataset is evaluated on its final 26 weeks, divided into two 13-week blocks. Models are refitted at the start of each block; forecasts and decisions are generated weekly. The evaluation is repeated after excluding the final 26 weeks and again after excluding the final 52 weeks, yielding three distinct 26-week windows per dataset (main, second, and third). Model fitting is repeated for each window. All experiments ran on a laptop CPU (Intel Core i5-12450H, 16 GB RAM). Code and results: [link to be added].</w:t>
+        <w:t>For M5 and VN1, the main window comprises the final 26 weeks; two earlier windows are formed by removing the last 26 and 52 weeks, respectively. The footwear panel has only its final 26-week window. Within each window, the models are refitted at the beginning of two 13-week blocks, while forecasts and inventory decisions are generated weekly. Training is repeated for every window. Experiments ran on an Intel Core i5-12450H laptop CPU with 16 GB of RAM. Code and result files: https://github.com/anhduyBA/forecast-to-decision-benchmark.</w:t>
       </w:r>
     </w:p>
     <w:p>
       <w:pPr>
         <w:pStyle w:val="Heading1"/>
+        <w:keepNext/>
       </w:pPr>
       <w:r>
         <w:t>5  RESULTS</w:t>
@@ -965,6 +1132,7 @@
     <w:p>
       <w:pPr>
         <w:pStyle w:val="Heading2"/>
+        <w:keepNext/>
       </w:pPr>
       <w:r>
         <w:t>5.1  Forecast accuracy</w:t>
@@ -973,9 +1141,11 @@
     <w:p>
       <w:pPr>
         <w:pStyle w:val="TableCaption"/>
+        <w:keepNext/>
+        <w:spacing w:before="80" w:after="60"/>
       </w:pPr>
       <w:r>
-        <w:t>Table 2. Forecast accuracy for h = 3 across all eligible series. Windows are main, second, and third. Lower wQL, median loss, and mean rank indicate better performance.</w:t>
+        <w:t>Table 2. Three-week forecast accuracy, by dataset and window. Lower values indicate better performance; wQL is volume-weighted quantile loss.</w:t>
       </w:r>
     </w:p>
     <w:tbl>
@@ -999,6 +1169,7 @@
       <w:tr>
         <w:trPr>
           <w:tblHeader w:val="true"/>
+          <w:tblHeader w:val="true"/>
         </w:trPr>
         <w:tc>
           <w:tcPr>
@@ -5461,6 +5632,7 @@
     </w:tbl>
     <w:p>
       <w:pPr>
+        <w:widowControl/>
         <w:spacing w:after="0" w:before="0"/>
       </w:pPr>
     </w:p>
@@ -5469,43 +5641,53 @@
         <w:pStyle w:val="SmallNote"/>
       </w:pPr>
       <w:r>
-        <w:t>Nemenyi critical difference (α = 0.05), main / second / third: M5 = 0.052 / 0.052 / 0.053; VN1 = 0.077 / 0.084 / 0.093. At h = 13, mean per-series ranks are: M5—LGB-Q 3.45 / 3.43 / 3.50, HGB-Q 3.38 / 3.45 / 3.50, TSB-NB 4.16 / 4.04 / 4.05; VN1—LGB-Q 4.02 / 3.48 / 3.85, HGB-Q 3.85 / 3.46 / 3.57, TSB-NB 2.92 / 2.99 / 3.37.</w:t>
+        <w:t>Nemenyi critical difference (α = 0.05), main / second / third: M5 0.052 / 0.052 / 0.053; VN1 0.077 / 0.084 / 0.093. At h = 13, TSB-NB has the best mean VN1 rank in every window (2.92 / 2.99 / 3.37).</w:t>
       </w:r>
     </w:p>
     <w:p>
-      <w:pPr/>
+      <w:pPr>
+        <w:widowControl/>
+      </w:pPr>
       <w:r>
-        <w:t>At h = 3, LGB-Q produces the lowest volume-weighted quantile loss on M5 and VN1 in all three windows; HGB-Q differs by no more than 0.002 (Table 2). Within every demand class, LGB-Q also has the lowest wQL in each dataset and window. On M5, LGB-Q has the lowest mean per-series rank at h = 3 in every window, with differences from HGB-Q exceeding the Nemenyi critical difference.</w:t>
+        <w:t>LGB-Q has the lowest wQL at h = 3 in both datasets and all three windows (Table 2); HGB-Q is within 0.002. The same wQL ordering holds within each demand class. On M5, the average per-series rank also favours LGB-Q in every window, by more than the Nemenyi critical difference relative to HGB-Q.</w:t>
       </w:r>
     </w:p>
     <w:p>
-      <w:pPr/>
+      <w:pPr>
+        <w:widowControl/>
+      </w:pPr>
       <w:r>
-        <w:t>The per-series results on VN1 are less decisive. LGB-Q, HGB-Q, and TSB-NB differ by at most 0.17 mean ranks at h = 3, and the LGB-Q versus HGB-Q difference is below the critical difference. At h = 13, TSB-NB has the lowest mean per-series rank in each window. Consequently, the global models’ advantage in aggregate weighted loss does not imply a uniform advantage across VN1 series. The mean scaled loss for LGB-Q on VN1 increases from 0.336 to 0.539 and 2.008 across the three windows, driven by a small number of series with very small naïve-error denominators; the corresponding wQL values are 0.103, 0.078, and 0.102.</w:t>
+        <w:t>The VN1 rankings are less clear at series level. At h = 3, LGB-Q, HGB-Q and TSB-NB are separated by no more than 0.17 mean ranks, with no significant LGB-Q–HGB-Q difference under the Nemenyi criterion. At h = 13, TSB-NB ranks first in all three windows. Its mean scaled loss on VN1 is 0.336, 0.539 and 2.008 across the windows, inflated by a few series with very small naïve-error denominators; wQL remains 0.103, 0.078 and 0.102.</w:t>
       </w:r>
     </w:p>
     <w:p>
       <w:pPr>
         <w:pStyle w:val="Heading2"/>
+        <w:keepNext/>
       </w:pPr>
       <w:r>
         <w:t>5.2  Inventory at equal realised fill rate</w:t>
       </w:r>
     </w:p>
     <w:p>
-      <w:pPr/>
+      <w:pPr>
+        <w:widowControl/>
+      </w:pPr>
       <w:r>
-        <w:t>M5. LGB-Q has the lowest frontier rank in every bootstrap resample across all three windows. At a realised fill rate of 0.94, it requires 3.3–10.6% less inventory than LGB-T, LGB-C, TSB-NB, and ETS, with the reported confidence intervals excluding zero (Table 3). HGB-Q is within 0.2–1.4% of LGB-Q.</w:t>
-      </w:r>
-    </w:p>
-    <w:p>
-      <w:pPr/>
-      <w:r>
-        <w:t>VN1. Rankings change between windows. LGB-Q has the lowest frontier rank in the main window, but its inventory advantage over LGB-T, LGB-C, and TSB-NB at a fill rate of 0.94 is not statistically resolved by the reported intervals. TSB-NB leads in the second window, with TSB-NB, LGB-T, and LGB-C requiring 4.1–8.8% less inventory than LGB-Q. In the third window, LGB-Q leads, while TSB-NB, ETS, and LGB-T fail to reach a fill rate of 0.94 at the evaluated quantile levels. Thus, the method with the lowest weighted forecast loss does not consistently require the least inventory on VN1.</w:t>
+        <w:t>M5. LGB-Q ranks first on the inventory frontier (Figure 1) in all bootstrap resamples across the three windows. At fill rate 0.94, it needs 3.3–10.6% less stock than LGB-T, LGB-C, TSB-NB and ETS, with the reported intervals excluding zero (Table 3). HGB-Q's inventory requirement differs by 0.2–1.4%.</w:t>
       </w:r>
     </w:p>
     <w:p>
       <w:pPr>
+        <w:widowControl/>
+      </w:pPr>
+      <w:r>
+        <w:t>VN1. The preferred method depends on the window. LGB-Q ranks first in the main window, although its stock advantage over LGB-T, LGB-C and TSB-NB at fill rate 0.94 is not established by the reported confidence intervals. In the second window, TSB-NB ranks first; TSB-NB, LGB-T and LGB-C need 4.1–8.8% less inventory than LGB-Q. In the third, LGB-Q again leads, while TSB-NB, ETS and LGB-T do not attain fill rate 0.94 at any evaluated τ. Lowest wQL does not always mean lowest stock on VN1.</w:t>
+      </w:r>
+    </w:p>
+    <w:p>
+      <w:pPr>
+        <w:widowControl/>
         <w:spacing w:after="40"/>
         <w:jc w:val="center"/>
       </w:pPr>
@@ -5547,17 +5729,21 @@
     <w:p>
       <w:pPr>
         <w:pStyle w:val="FigureCaption"/>
+        <w:keepNext/>
+        <w:spacing w:before="80" w:after="60"/>
       </w:pPr>
       <w:r>
-        <w:t>Figure 1. Average inventory (weeks of demand) versus realised fill rate for the main test window: (a) M5 and (b) VN1. The target τ varies from 0.50 to 0.99. Curves toward the upper left indicate less inventory for a given fill rate. Solid lines denote direct quantile models.</w:t>
+        <w:t>Figure 1. Inventory in weeks of demand against realised fill rate in the main window: (a) M5, (b) VN1. τ ranges from 0.50 to 0.99; solid curves represent direct quantile methods.</w:t>
       </w:r>
     </w:p>
     <w:p>
       <w:pPr>
         <w:pStyle w:val="TableCaption"/>
+        <w:keepNext/>
+        <w:spacing w:before="80" w:after="60"/>
       </w:pPr>
       <w:r>
-        <w:t>Table 3. Inventory required at fill rate 0.94 (weeks of demand) and relative differences versus LGB-Q. Values in brackets are 95% bootstrap confidence intervals. Δ = I_method / I_LGB-Q − 1; positive values favour LGB-Q. “—” indicates that fill rate 0.94 was not reached.</w:t>
+        <w:t>Table 3. Inventory needed for fill rate 0.94. Δ = I_method / I_LGB-Q − 1 (%); positive values favour LGB-Q. Brackets show 95% bootstrap intervals; “—” means the method did not reach 0.94.</w:t>
       </w:r>
     </w:p>
     <w:tbl>
@@ -5583,6 +5769,7 @@
       <w:tr>
         <w:trPr>
           <w:tblHeader w:val="true"/>
+          <w:tblHeader w:val="true"/>
         </w:trPr>
         <w:tc>
           <w:tcPr>
@@ -6547,7 +6734,7 @@
               </w:rPr>
               <w:t>+0.2</w:t>
               <w:br/>
-              <w:t>[-0.2,+0.5]</w:t>
+              <w:t>[−0.2,+0.5]</w:t>
             </w:r>
           </w:p>
         </w:tc>
@@ -6838,7 +7025,7 @@
               </w:rPr>
               <w:t>+0.9</w:t>
               <w:br/>
-              <w:t>[-7.5,+9.9]</w:t>
+              <w:t>[−7.5,+9.9]</w:t>
             </w:r>
           </w:p>
         </w:tc>
@@ -6865,7 +7052,7 @@
               </w:rPr>
               <w:t>+1.7</w:t>
               <w:br/>
-              <w:t>[-6.3,+8.7]</w:t>
+              <w:t>[−6.3,+8.7]</w:t>
             </w:r>
           </w:p>
         </w:tc>
@@ -6892,7 +7079,7 @@
               </w:rPr>
               <w:t>+10.5</w:t>
               <w:br/>
-              <w:t>[-0.5,+19.8]</w:t>
+              <w:t>[−0.5,+19.8]</w:t>
             </w:r>
           </w:p>
         </w:tc>
@@ -7073,9 +7260,9 @@
               <w:rPr>
                 <w:sz w:val="13"/>
               </w:rPr>
-              <w:t>-1.2</w:t>
+              <w:t>−1.2</w:t>
               <w:br/>
-              <w:t>[-2.5,+0.2]</w:t>
+              <w:t>[−2.5,+0.2]</w:t>
             </w:r>
           </w:p>
         </w:tc>
@@ -7100,9 +7287,9 @@
               <w:rPr>
                 <w:sz w:val="13"/>
               </w:rPr>
-              <w:t>-7.7</w:t>
+              <w:t>−7.7</w:t>
               <w:br/>
-              <w:t>[-11.8,-3.8]</w:t>
+              <w:t>[−11.8,−3.8]</w:t>
             </w:r>
           </w:p>
         </w:tc>
@@ -7127,9 +7314,9 @@
               <w:rPr>
                 <w:sz w:val="13"/>
               </w:rPr>
-              <w:t>-4.1</w:t>
+              <w:t>−4.1</w:t>
               <w:br/>
-              <w:t>[-7.3,-0.9]</w:t>
+              <w:t>[−7.3,−0.9]</w:t>
             </w:r>
           </w:p>
         </w:tc>
@@ -7154,9 +7341,9 @@
               <w:rPr>
                 <w:sz w:val="13"/>
               </w:rPr>
-              <w:t>-8.8</w:t>
+              <w:t>−8.8</w:t>
               <w:br/>
-              <w:t>[-12.8,-4.9]</w:t>
+              <w:t>[−12.8,−4.9]</w:t>
             </w:r>
           </w:p>
         </w:tc>
@@ -7181,9 +7368,9 @@
               <w:rPr>
                 <w:sz w:val="13"/>
               </w:rPr>
-              <w:t>-0.4</w:t>
+              <w:t>−0.4</w:t>
               <w:br/>
-              <w:t>[-5.7,+4.2]</w:t>
+              <w:t>[−5.7,+4.2]</w:t>
             </w:r>
           </w:p>
         </w:tc>
@@ -7339,7 +7526,7 @@
               </w:rPr>
               <w:t>+1.3</w:t>
               <w:br/>
-              <w:t>[-0.7,+3.5]</w:t>
+              <w:t>[−0.7,+3.5]</w:t>
             </w:r>
           </w:p>
         </w:tc>
@@ -7449,18 +7636,22 @@
     </w:tbl>
     <w:p>
       <w:pPr>
+        <w:widowControl/>
         <w:spacing w:after="0" w:before="0"/>
       </w:pPr>
     </w:p>
     <w:p>
-      <w:pPr/>
+      <w:pPr>
+        <w:widowControl/>
+      </w:pPr>
       <w:r>
-        <w:t>Across demand classes, LGB-Q has the lowest inventory requirements for the smooth, intermittent, and lumpy M5 classes in all windows. On VN1, only the lumpy class is led by LGB-Q throughout; TSB-NB leads the smooth class in two windows, and LGB-C leads it in the third.</w:t>
+        <w:t>LGB-Q requires the least inventory in the smooth, intermittent and lumpy M5 classes in all three windows. On VN1 it leads the lumpy class consistently, but not the smooth class: TSB-NB leads that class twice and LGB-C once.</w:t>
       </w:r>
     </w:p>
     <w:p>
       <w:pPr>
         <w:pStyle w:val="Heading2"/>
+        <w:keepNext/>
       </w:pPr>
       <w:r>
         <w:t>5.3  Period variation on VN1</w:t>
@@ -7469,9 +7660,11 @@
     <w:p>
       <w:pPr>
         <w:pStyle w:val="TableCaption"/>
+        <w:keepNext/>
+        <w:spacing w:before="80" w:after="60"/>
       </w:pPr>
       <w:r>
-        <w:t>Table 4. Ex-post demand groups, defined using realised demand in the test period relative to the preceding 26 weeks: stable = 0.67–1.50× and growing &gt; 1.50×. Inventory differences at fill rate 0.92 are Δ = I_TSB-NB / I_LGB-Q − 1. Positive Δ favours LGB-Q; “not reached” indicates TSB-NB cannot attain 0.92.</w:t>
+        <w:t>Table 4. Demand groups defined retrospectively from test-period demand relative to the preceding 26 weeks (stable: 0.67–1.50×; growing: &gt;1.50×). Δ compares TSB-NB inventory with LGB-Q at fill rate 0.92.</w:t>
       </w:r>
     </w:p>
     <w:tbl>
@@ -7493,6 +7686,7 @@
       <w:tr>
         <w:trPr>
           <w:tblHeader w:val="true"/>
+          <w:tblHeader w:val="true"/>
         </w:trPr>
         <w:tc>
           <w:tcPr>
@@ -8579,24 +8773,30 @@
     </w:tbl>
     <w:p>
       <w:pPr>
+        <w:widowControl/>
         <w:spacing w:after="0" w:before="0"/>
       </w:pPr>
     </w:p>
     <w:p>
-      <w:pPr/>
+      <w:pPr>
+        <w:widowControl/>
+      </w:pPr>
       <w:r>
-        <w:t>For each window we classify series by the ratio of realised test-period demand to demand in the preceding 26 weeks. Stable-demand series have ratios from 0.67 to 1.50; growing-demand series exceed 1.50. Because the classification uses test-period outcomes, it is descriptive and cannot be used directly for prospective model selection.</w:t>
+        <w:t>For this analysis only, we group series according to the realised ratio of test-window demand to demand in the preceding 26 weeks. Ratios of 0.67–1.50 define the stable group; ratios above 1.50 define the growing group. Because grouping uses outcomes from the test window itself, it cannot be applied as a forecasting-time selection rule.</w:t>
       </w:r>
     </w:p>
     <w:p>
-      <w:pPr/>
+      <w:pPr>
+        <w:widowControl/>
+      </w:pPr>
       <w:r>
-        <w:t>On VN1 stable-demand series, TSB-NB requires 13.3–15.6% less inventory than LGB-Q across the three windows (Table 4). For growing-demand series, TSB-NB does not achieve a fill rate of 0.92 in the main and third windows, while LGB-Q does. Growing series account for 31.5% and 40.4% of test demand in those two windows, compared with 22.8% in the second window, when TSB-NB leads overall. This association is consistent with demand-growth composition contributing to the aggregate ranking, but it does not establish a causal mechanism. On M5, LGB-Q requires less inventory in both reported groups in all three windows.</w:t>
+        <w:t>The stable-demand VN1 group favours TSB-NB in each window: at fill rate 0.92, it uses 13.3–15.6% less inventory than LGB-Q (Table 4). For growing VN1 series, TSB-NB fails to reach that fill rate in the main and third windows, while LGB-Q reaches it. Growing series account for 31.5% and 40.4% of test demand in those windows, compared with 22.8% in the second window, where TSB-NB leads overall. This pattern associates the ranking with demand composition but does not establish causation. On M5, LGB-Q needs less stock in both groups throughout.</w:t>
       </w:r>
     </w:p>
     <w:p>
       <w:pPr>
         <w:pStyle w:val="Heading2"/>
+        <w:keepNext/>
       </w:pPr>
       <w:r>
         <w:t>5.4  Prospective method selection using demand groups</w:t>
@@ -8605,9 +8805,11 @@
     <w:p>
       <w:pPr>
         <w:pStyle w:val="TableCaption"/>
+        <w:keepNext/>
+        <w:spacing w:before="80" w:after="60"/>
       </w:pPr>
       <w:r>
-        <w:t>Table 5. Method-selection rules fitted in one window and applied to the next. Entries show inventory change (%) at fill rate 0.94 relative to always using LGB-Q; negative values indicate lower inventory. Brackets contain 95% bootstrap confidence intervals.</w:t>
+        <w:t>Table 5. Selection rules trained on one window and evaluated on the next. Numbers are inventory changes (%) relative to always using LGB-Q at fill rate 0.94; negatives favour the rule. Brackets give 95% bootstrap intervals.</w:t>
       </w:r>
     </w:p>
     <w:tbl>
@@ -8628,6 +8830,7 @@
       <w:tr>
         <w:trPr>
           <w:tblHeader w:val="true"/>
+          <w:tblHeader w:val="true"/>
         </w:trPr>
         <w:tc>
           <w:tcPr>
@@ -9585,44 +9788,55 @@
     </w:tbl>
     <w:p>
       <w:pPr>
+        <w:widowControl/>
         <w:spacing w:after="0" w:before="0"/>
       </w:pPr>
     </w:p>
     <w:p>
-      <w:pPr/>
+      <w:pPr>
+        <w:widowControl/>
+      </w:pPr>
       <w:r>
-        <w:t>Method selection by group would be useful if demand changes could be anticipated from historical characteristics. We test ADI–CV² classes and an unsupervised segmentation based on eight pre-test features: demand level, order size, ADI, CV², time since last sale, trend, recent relative level, and peak size. Clustering is fitted on the earliest window and applied without refitting to later windows. A three-component Gaussian mixture, labelled regular, fading, and sparse, is chosen from K-means and mixture candidates using predefined criteria. Its adjusted Rand index across refits is 0.94, although group separation is weak (silhouette = 0.21).</w:t>
+        <w:t>We next ask whether information available before a window can identify which forecaster to use. In addition to ADI–CV² classes, we cluster series using eight historical features: level, order size, ADI, CV², time since sale, trend, recent relative level and peak size. ADI, CV² and time since sale are log-transformed; all eight features are then centred on their medians, divided by their interquartile ranges and clipped at ±4, with these statistics taken from the fitting window. The clustering fitted on the earliest window is carried forward unchanged. Predefined criteria select a three-component Gaussian mixture (regular, fading, sparse) that is stable across refits (adjusted Rand index 0.94) but overlapping (silhouette 0.21).</w:t>
       </w:r>
     </w:p>
     <w:p>
-      <w:pPr/>
+      <w:pPr>
+        <w:widowControl/>
+      </w:pPr>
       <w:r>
-        <w:t>Neither grouping yields consistent improvements (Table 5). On M5, selecting each group’s previously best method changes inventory by at most 0.3% relative to LGB-Q. On VN1, class-based selection reduces inventory by 5.6% in one transfer but increases it by 5.1% in the next. Segment-based selection changes inventory by −0.1% and +10.5%, respectively. An ex-post oracle selecting the best method in each segment does not outperform the best single method for that same window; within-window leading methods are shared across the segments. The proportion of growing series remains broadly distributed across groups: 18–31% for the three segments and 14–39% for the four ADI–CV² classes in VN1.</w:t>
+        <w:t>Neither grouping gives reliable improvements (Table 5). On M5, choosing the best method for each group in the previous window changes inventory by no more than 0.3% relative to LGB-Q. For VN1, class-based selection first saves 5.6% and then requires 5.1% more stock; segmentation produces changes of −0.1% and +10.5%. Even a retrospective oracle choosing the best method within each segment cannot beat the best single method of that window. Growing series appear across the groups rather than in a distinct cluster: they represent 18–31% of each VN1 segment and 14–39% of each ADI–CV² class.</w:t>
       </w:r>
     </w:p>
     <w:p>
       <w:pPr>
         <w:pStyle w:val="Heading2"/>
+        <w:keepNext/>
       </w:pPr>
       <w:r>
         <w:t>5.5  Inventory performance of averaged quantiles</w:t>
       </w:r>
     </w:p>
     <w:p>
-      <w:pPr/>
+      <w:pPr>
+        <w:widowControl/>
+      </w:pPr>
       <w:r>
-        <w:t>LGB-Q and TSB-NB show different inventory outcomes across VN1 demand groups. We therefore examine C2, an equal-weight mean of corresponding LGB-Q and TSB-NB quantiles, without predicting demand growth. This model pair was chosen after inspecting the component-method results; the reported C2 evaluation is thus post hoc and not an independent out-of-sample validation.</w:t>
+        <w:t>The complementary VN1 results for LGB-Q and TSB-NB suggest testing their average, C2, the arithmetic mean of the two methods' quantiles. We chose these two inputs after inspecting their relative performance, so C2 is exploratory and post hoc. To test combination without that choice, we fixed a second design before running it: the mean (E7) and the median (E7-med) of all seven methods' quantiles, leave-one-out ablations of E7, and a prospective rule that applies the lowest-regret mean subset of one window to the next.</w:t>
       </w:r>
     </w:p>
     <w:p>
-      <w:pPr/>
+      <w:pPr>
+        <w:widowControl/>
+      </w:pPr>
       <w:r>
-        <w:t>At a realised fill rate of 0.92, C2 requires 5.9%, 10.5%, and 7.1% less inventory than LGB-Q on VN1 in the main, second, and third windows, respectively. All reported bootstrap intervals exclude zero; in the second window, C2 matches TSB-NB. On M5, C2 remains within 1.5% of LGB-Q. Its volume-weighted quantile loss is slightly above that of LGB-Q. Adding HGB-Q to the combination produces similar reported outcomes. With one- and four-week lead times in the VN1 main window, C2 requires 4.1% and 5.4% less inventory than LGB-Q, respectively, at a fill rate of 0.94. These lead-time checks do not extend to the other test windows.</w:t>
+        <w:t>At fill rate 0.92, C2 uses 5.9%, 10.5% and 7.1% less VN1 inventory than LGB-Q in the main, second and third windows and E7-med 7.6%, 8.2% and 7.1% less, with all series-bootstrap intervals excluding zero (but see Section 5.8). On M5 both stay within 1.6% of LGB-Q, whereas E7 needs up to 3.1% more and so misses our preset criterion. Every combination has a higher wQL than LGB-Q. Removing LGB-Q or HGB-Q from E7 raises its stock by 1.0–4.5%, removing ETS lowers it in all six runs, and the lowest-regret subset of every run contains LGB-Q and TSB-NB. At matched realised fill, the prospective rule saves 7.8–8.2% on VN1 in both transitions but needs 0.9% more on M5 in one. C2 also saves VN1 inventory at one- and four-week lead times (Section 5.8).</w:t>
       </w:r>
     </w:p>
     <w:p>
       <w:pPr>
         <w:pStyle w:val="Heading2"/>
+        <w:keepNext/>
       </w:pPr>
       <w:r>
         <w:t>5.6  Liquidation outcomes</w:t>
@@ -9631,9 +9845,11 @@
     <w:p>
       <w:pPr>
         <w:pStyle w:val="TableCaption"/>
+        <w:keepNext/>
+        <w:spacing w:before="80" w:after="60"/>
       </w:pPr>
       <w:r>
-        <w:t>Table 6. Liquidation policies using LGB-Q forecasts. Results are listed separately for the main, second, and third test windows. Changes are relative to no liquidation. s* is the break-even salvage ratio (upper-bound range across holding costs of 10–40% per year, gross margins of 30–100%, and four machine-learning models).</w:t>
+        <w:t>Table 6. Changes relative to no liquidation when LGB-Q supplies the forecasts. Break-even salvage ratios s* are calculated under the specified holding-cost and markup assumptions.</w:t>
       </w:r>
     </w:p>
     <w:tbl>
@@ -9657,6 +9873,7 @@
       <w:tr>
         <w:trPr>
           <w:tblHeader w:val="true"/>
+          <w:tblHeader w:val="true"/>
         </w:trPr>
         <w:tc>
           <w:tcPr>
@@ -13521,102 +13738,1698 @@
     </w:tbl>
     <w:p>
       <w:pPr>
+        <w:widowControl/>
         <w:spacing w:after="0" w:before="0"/>
       </w:pPr>
     </w:p>
     <w:p>
-      <w:pPr/>
+      <w:pPr>
+        <w:widowControl/>
+      </w:pPr>
       <w:r>
-        <w:t>The quantile liquidation rule reduces realised fill rate by at most 0.02 percentage points with LGB-Q in every dataset–window combination. It almost never activates on M5 and reduces inventory by 1.7–7.4% on VN1. The fixed and dead13 policies incur larger service losses, increasing the stockout rate by 5–20% and 10–23%, respectively (Table 6).</w:t>
+        <w:t>With LGB-Q forecasts, the quantile rule lowers fill rate by no more than 0.02 percentage points in any window (Table 6). It rarely removes stock on M5; on VN1, it reduces inventory by 1.7–7.4%. Fixed and dead13 liquidation have larger service effects, increasing stockout rates by 5–20% and 10–23%, respectively.</w:t>
       </w:r>
     </w:p>
     <w:p>
-      <w:pPr/>
+      <w:pPr>
+        <w:widowControl/>
+      </w:pPr>
       <w:r>
-        <w:t>Under the assumed cost specification, none of the liquidation policies demonstrates a consistent economic benefit over the 26-week horizon. For the VN1 quantile rule, the break-even salvage ratios range from 0.91 to 1.21 times unit cost; the corresponding lower bound for the remaining evaluated rules is 0.97. These are model-based thresholds, not observed resale proceeds or realised profits.</w:t>
+        <w:t>None of the policies has a consistent economic advantage over the 26-week simulation under the assumed costs. For quantile liquidation on VN1, the break-even salvage ratio ranges from 0.91 to 1.21 times unit purchase cost. Ratios for the remaining policies have a lower bound of 0.97. These figures are upper-bound thresholds from the cost model of Section 3.4, not measured resale revenues or realised profits. In practice the rule is direct: liquidate only if the expected recovery ratio r on the secondary market (salvage price divided by unit cost) exceeds s*. With the VN1 quantile-rule thresholds of 0.91–1.21, a channel that recovers 60% of cost would not justify liquidation within 26 weeks, whereas one that recovers about unit cost could. Obsolescence, scarce storage space or a longer horizon would lower s* and are not modelled here.</w:t>
       </w:r>
     </w:p>
     <w:p>
       <w:pPr>
         <w:pStyle w:val="Heading2"/>
+        <w:keepNext/>
       </w:pPr>
       <w:r>
         <w:t>5.7  Sensitivity to dataset differences</w:t>
       </w:r>
     </w:p>
     <w:p>
-      <w:pPr/>
+      <w:pPr>
+        <w:widowControl/>
+      </w:pPr>
       <w:r>
-        <w:t>We examine three potential sources of dataset-specific results (further details are reported in the repository). Reweighting VN1 series to match the M5 demand-feature distribution reduces the mean standardised difference from 0.32–0.39 to 0.02–0.03, without changing the reported VN1 conclusions. Removing price features from the VN1 global models, for which price is observed in fewer than half of the weeks, and restricting M5 models to the 21 features shared with VN1 each change the inventory required by LGB-Q by less than 1% across the tested windows. These checks do not explain the observed differences through the examined feature-distribution and preprocessing variations. Other differences between the datasets remain possible.</w:t>
+        <w:t>We tested whether specific differences between M5 and VN1 account for the contrasting rankings. Reweighting VN1 to approximate M5's demand-feature distribution reduces the mean standardised difference from 0.32–0.39 to 0.02–0.03 without altering the VN1 findings. Removing VN1's sparse price variables or limiting M5 to its 21 features shared with VN1 changes LGB-Q inventory by less than 1% in every window. Other dataset differences remain untested.</w:t>
       </w:r>
     </w:p>
     <w:p>
       <w:pPr>
+        <w:pStyle w:val="Heading2"/>
+        <w:keepNext/>
+      </w:pPr>
+      <w:r>
+        <w:t>5.8  Robustness checks and a neural baseline</w:t>
+      </w:r>
+    </w:p>
+    <w:p>
+      <w:pPr>
+        <w:widowControl/>
+      </w:pPr>
+      <w:r>
+        <w:t>Hyperparameters. Refitting LGB-Q and LGB-T for h = 3 in the main window with small (15 leaves), large (255) and regularised (31 leaves, at least 500 samples per leaf, L2 penalty 10) trees leaves LGB-Q 4.7–6.8% below LGB-T and 7.5–11.0% below TSB-NB in inventory on M5 at fill rate 0.92, with its own inventory changing by less than 3%. The VN1 ranking persists for three settings; with small trees LGB-T uses 8.9% less inventory than LGB-Q.</w:t>
+      </w:r>
+    </w:p>
+    <w:p>
+      <w:pPr>
+        <w:widowControl/>
+      </w:pPr>
+      <w:r>
+        <w:t>Lead time. At lead times of one and four weeks in every window (HGB-Q omitted), LGB-Q needs less inventory on M5 than LGB-T, LGB-C, TSB-NB and ETS in all nine window–lead-time runs (2.5–14.8% at fill rate 0.94). On VN1 the post hoc C2 uses 3.2–10.9% less inventory than LGB-Q at fill rate 0.92 in all nine runs, with intervals excluding zero in seven; its maximum regret over the 18 runs is 2.0%, against 12.6% for LGB-Q.</w:t>
+      </w:r>
+    </w:p>
+    <w:p>
+      <w:pPr>
+        <w:widowControl/>
+      </w:pPr>
+      <w:r>
+        <w:t>Neural baseline. We evaluated a univariate N-HiTS network [26] separately from the seven-method benchmark. It predicts quantiles of cumulative h-week demand with a multi-quantile loss, is refitted every 13 weeks and uses fixed hyperparameters. It never leads on inventory. At fill rates of 0.90–0.94 on M5 it needs 2.6–10.0% more stock than LGB-Q; its frontier ranks on VN1, among eight single methods, range from 2.8 to 4.4. It is a CPU-budgeted baseline, not evidence about deep learning as a class.</w:t>
+      </w:r>
+    </w:p>
+    <w:p>
+      <w:pPr>
+        <w:widowControl/>
+      </w:pPr>
+      <w:r>
+        <w:t>Computational cost. Except Chronos-2, every method forecasts a 26-week window within minutes on the laptop CPU (TSB-NB 1–2, LGB-Q on M5 10–21, N-HiTS about 7). Zero-shot Chronos-2 [22] needs no training, but its inference took 5.4 hours per M5 window and 32–45 minutes per VN1 window, while needing 14.7% (M5) and 1.2–48.1% (VN1) more inventory than LGB-Q at fill rate 0.92; it ran without fine-tuning or covariates.</w:t>
+      </w:r>
+    </w:p>
+    <w:p>
+      <w:pPr>
+        <w:widowControl/>
+      </w:pPr>
+      <w:r>
+        <w:t>Prospective τ, resampling and a third dataset. Choosing each method's τ on the previous window puts every method except EMP within 0.8 points of the target fill on M5, where LGB-T, LGB-C, TSB-NB and ETS then need 3.8–14.2% more inventory than LGB-Q. On VN1 the realised fill misses the target by up to 4.6 points for LGB-Q, HGB-Q, C2 and E7-med; updating τ every week by half the gap between the target and the fill realised so far reduces the miss to 2.4 points, above our one-point criterion. Table 7 separates the target (0.92) from the achieved fill (0.906–0.926 on M5, 0.906–0.940 on VN1, 0.865–0.893 on the footwear panel); LGB-Q meets the target within 0.5 points in one of five cases. Its intervals rerun the past-only policy, τ path included, in 2,000 paired cluster replicates and are wider than with τ held fixed, most on VN1. Of the 13 comparisons whose achieved fills are within 0.5 points of LGB-Q's (none on the footwear panel), one shows a significant saving (C2 on VN1, 7.4%), five need significantly more stock and seven are inconclusive; with thresholds of 0.25 or 1.0 points, 10 or 17 qualify and one or two show a saving. No method is therefore shown to beat LGB-Q where service differs. Resampling items, stores or blocks of weeks leaves every M5 interval claim intact, whereas for the matched-fill comparisons warehouse- or client-level resampling leaves only the second-window VN1 savings significant.</w:t>
+      </w:r>
+    </w:p>
+    <w:p>
+      <w:pPr>
+        <w:pStyle w:val="TableCaption"/>
+        <w:widowControl/>
+      </w:pPr>
+      <w:r>
+        <w:t>Table 7. Past-only service calibration (τ updated weekly, η = 0.5); target fill 0.92 throughout, Fill = achieved fill. ΔI = inventory relative to LGB-Q (%), 95% full-policy cluster-bootstrap intervals (τ path recomputed per replicate; M5 items, VN1 warehouses, footwear styles); LGB-Q rows: weeks of demand. † = fills differ by ≥ 0.5 points, not like-for-like.</w:t>
+      </w:r>
+    </w:p>
+    <w:tbl>
+      <w:tblPr>
+        <w:tblStyle w:val="TableGrid"/>
+        <w:tblW w:type="auto" w:w="0"/>
+        <w:jc w:val="center"/>
+        <w:tblLook w:firstColumn="1" w:firstRow="1" w:lastColumn="0" w:lastRow="0" w:noHBand="0" w:noVBand="1" w:val="04A0"/>
+        <w:tblLayout w:type="fixed"/>
+      </w:tblPr>
+      <w:tblGrid>
+        <w:gridCol w:w="864"/>
+        <w:gridCol w:w="648"/>
+        <w:gridCol w:w="1137"/>
+        <w:gridCol w:w="648"/>
+        <w:gridCol w:w="1137"/>
+        <w:gridCol w:w="648"/>
+        <w:gridCol w:w="1137"/>
+        <w:gridCol w:w="648"/>
+        <w:gridCol w:w="1137"/>
+        <w:gridCol w:w="648"/>
+        <w:gridCol w:w="1137"/>
+      </w:tblGrid>
+      <w:tr>
+        <w:tc>
+          <w:tcPr>
+            <w:tcW w:type="dxa" w:w="864"/>
+            <w:vMerge w:val="restart"/>
+          </w:tcPr>
+          <w:p>
+            <w:pPr>
+              <w:pStyle w:val="CellText"/>
+              <w:jc w:val="center"/>
+            </w:pPr>
+            <w:r>
+              <w:rPr>
+                <w:b/>
+                <w:sz w:val="14"/>
+              </w:rPr>
+              <w:t>Method</w:t>
+            </w:r>
+          </w:p>
+        </w:tc>
+        <w:tc>
+          <w:tcPr>
+            <w:tcW w:type="dxa" w:w="1138"/>
+            <w:gridSpan w:val="2"/>
+          </w:tcPr>
+          <w:p>
+            <w:pPr>
+              <w:pStyle w:val="CellText"/>
+              <w:jc w:val="center"/>
+            </w:pPr>
+            <w:r>
+              <w:rPr>
+                <w:b/>
+                <w:sz w:val="14"/>
+              </w:rPr>
+              <w:t>M5 3→2</w:t>
+            </w:r>
+          </w:p>
+        </w:tc>
+        <w:tc>
+          <w:tcPr>
+            <w:tcW w:type="dxa" w:w="1138"/>
+            <w:gridSpan w:val="2"/>
+          </w:tcPr>
+          <w:p>
+            <w:pPr>
+              <w:pStyle w:val="CellText"/>
+              <w:jc w:val="center"/>
+            </w:pPr>
+            <w:r>
+              <w:rPr>
+                <w:b/>
+                <w:sz w:val="14"/>
+              </w:rPr>
+              <w:t>M5 2→main</w:t>
+            </w:r>
+          </w:p>
+        </w:tc>
+        <w:tc>
+          <w:tcPr>
+            <w:tcW w:type="dxa" w:w="1138"/>
+            <w:gridSpan w:val="2"/>
+          </w:tcPr>
+          <w:p>
+            <w:pPr>
+              <w:pStyle w:val="CellText"/>
+              <w:jc w:val="center"/>
+            </w:pPr>
+            <w:r>
+              <w:rPr>
+                <w:b/>
+                <w:sz w:val="14"/>
+              </w:rPr>
+              <w:t>VN1 3→2</w:t>
+            </w:r>
+          </w:p>
+        </w:tc>
+        <w:tc>
+          <w:tcPr>
+            <w:tcW w:type="dxa" w:w="1138"/>
+            <w:gridSpan w:val="2"/>
+          </w:tcPr>
+          <w:p>
+            <w:pPr>
+              <w:pStyle w:val="CellText"/>
+              <w:jc w:val="center"/>
+            </w:pPr>
+            <w:r>
+              <w:rPr>
+                <w:b/>
+                <w:sz w:val="14"/>
+              </w:rPr>
+              <w:t>VN1 2→main</w:t>
+            </w:r>
+          </w:p>
+        </w:tc>
+        <w:tc>
+          <w:tcPr>
+            <w:tcW w:type="dxa" w:w="1138"/>
+            <w:gridSpan w:val="2"/>
+          </w:tcPr>
+          <w:p>
+            <w:pPr>
+              <w:pStyle w:val="CellText"/>
+              <w:jc w:val="center"/>
+            </w:pPr>
+            <w:r>
+              <w:rPr>
+                <w:b/>
+                <w:sz w:val="14"/>
+              </w:rPr>
+              <w:t>Footwear</w:t>
+            </w:r>
+          </w:p>
+        </w:tc>
+      </w:tr>
+      <w:tr>
+        <w:tc>
+          <w:tcPr>
+            <w:tcW w:type="dxa" w:w="890"/>
+            <w:vMerge/>
+          </w:tcPr>
+          <w:p/>
+        </w:tc>
+        <w:tc>
+          <w:tcPr>
+            <w:tcW w:type="dxa" w:w="648"/>
+          </w:tcPr>
+          <w:p>
+            <w:pPr>
+              <w:pStyle w:val="CellText"/>
+              <w:jc w:val="center"/>
+            </w:pPr>
+            <w:r>
+              <w:rPr>
+                <w:b/>
+                <w:sz w:val="14"/>
+              </w:rPr>
+              <w:t>Fill</w:t>
+            </w:r>
+          </w:p>
+        </w:tc>
+        <w:tc>
+          <w:tcPr>
+            <w:tcW w:type="dxa" w:w="1138"/>
+          </w:tcPr>
+          <w:p>
+            <w:pPr>
+              <w:pStyle w:val="CellText"/>
+              <w:jc w:val="center"/>
+            </w:pPr>
+            <w:r>
+              <w:rPr>
+                <w:b/>
+                <w:sz w:val="14"/>
+              </w:rPr>
+              <w:t>ΔI %</w:t>
+            </w:r>
+          </w:p>
+        </w:tc>
+        <w:tc>
+          <w:tcPr>
+            <w:tcW w:type="dxa" w:w="648"/>
+          </w:tcPr>
+          <w:p>
+            <w:pPr>
+              <w:pStyle w:val="CellText"/>
+              <w:jc w:val="center"/>
+            </w:pPr>
+            <w:r>
+              <w:rPr>
+                <w:b/>
+                <w:sz w:val="14"/>
+              </w:rPr>
+              <w:t>Fill</w:t>
+            </w:r>
+          </w:p>
+        </w:tc>
+        <w:tc>
+          <w:tcPr>
+            <w:tcW w:type="dxa" w:w="1138"/>
+          </w:tcPr>
+          <w:p>
+            <w:pPr>
+              <w:pStyle w:val="CellText"/>
+              <w:jc w:val="center"/>
+            </w:pPr>
+            <w:r>
+              <w:rPr>
+                <w:b/>
+                <w:sz w:val="14"/>
+              </w:rPr>
+              <w:t>ΔI %</w:t>
+            </w:r>
+          </w:p>
+        </w:tc>
+        <w:tc>
+          <w:tcPr>
+            <w:tcW w:type="dxa" w:w="648"/>
+          </w:tcPr>
+          <w:p>
+            <w:pPr>
+              <w:pStyle w:val="CellText"/>
+              <w:jc w:val="center"/>
+            </w:pPr>
+            <w:r>
+              <w:rPr>
+                <w:b/>
+                <w:sz w:val="14"/>
+              </w:rPr>
+              <w:t>Fill</w:t>
+            </w:r>
+          </w:p>
+        </w:tc>
+        <w:tc>
+          <w:tcPr>
+            <w:tcW w:type="dxa" w:w="1138"/>
+          </w:tcPr>
+          <w:p>
+            <w:pPr>
+              <w:pStyle w:val="CellText"/>
+              <w:jc w:val="center"/>
+            </w:pPr>
+            <w:r>
+              <w:rPr>
+                <w:b/>
+                <w:sz w:val="14"/>
+              </w:rPr>
+              <w:t>ΔI %</w:t>
+            </w:r>
+          </w:p>
+        </w:tc>
+        <w:tc>
+          <w:tcPr>
+            <w:tcW w:type="dxa" w:w="648"/>
+          </w:tcPr>
+          <w:p>
+            <w:pPr>
+              <w:pStyle w:val="CellText"/>
+              <w:jc w:val="center"/>
+            </w:pPr>
+            <w:r>
+              <w:rPr>
+                <w:b/>
+                <w:sz w:val="14"/>
+              </w:rPr>
+              <w:t>Fill</w:t>
+            </w:r>
+          </w:p>
+        </w:tc>
+        <w:tc>
+          <w:tcPr>
+            <w:tcW w:type="dxa" w:w="1138"/>
+          </w:tcPr>
+          <w:p>
+            <w:pPr>
+              <w:pStyle w:val="CellText"/>
+              <w:jc w:val="center"/>
+            </w:pPr>
+            <w:r>
+              <w:rPr>
+                <w:b/>
+                <w:sz w:val="14"/>
+              </w:rPr>
+              <w:t>ΔI %</w:t>
+            </w:r>
+          </w:p>
+        </w:tc>
+        <w:tc>
+          <w:tcPr>
+            <w:tcW w:type="dxa" w:w="648"/>
+          </w:tcPr>
+          <w:p>
+            <w:pPr>
+              <w:pStyle w:val="CellText"/>
+              <w:jc w:val="center"/>
+            </w:pPr>
+            <w:r>
+              <w:rPr>
+                <w:b/>
+                <w:sz w:val="14"/>
+              </w:rPr>
+              <w:t>Fill</w:t>
+            </w:r>
+          </w:p>
+        </w:tc>
+        <w:tc>
+          <w:tcPr>
+            <w:tcW w:type="dxa" w:w="1138"/>
+          </w:tcPr>
+          <w:p>
+            <w:pPr>
+              <w:pStyle w:val="CellText"/>
+              <w:jc w:val="center"/>
+            </w:pPr>
+            <w:r>
+              <w:rPr>
+                <w:b/>
+                <w:sz w:val="14"/>
+              </w:rPr>
+              <w:t>ΔI %</w:t>
+            </w:r>
+          </w:p>
+        </w:tc>
+      </w:tr>
+      <w:tr>
+        <w:tc>
+          <w:tcPr>
+            <w:tcW w:type="dxa" w:w="864"/>
+          </w:tcPr>
+          <w:p>
+            <w:pPr>
+              <w:pStyle w:val="CellText"/>
+              <w:jc w:val="center"/>
+            </w:pPr>
+            <w:r>
+              <w:rPr>
+                <w:b w:val="0"/>
+                <w:sz w:val="14"/>
+              </w:rPr>
+              <w:t>LGB-Q</w:t>
+            </w:r>
+          </w:p>
+        </w:tc>
+        <w:tc>
+          <w:tcPr>
+            <w:tcW w:type="dxa" w:w="648"/>
+          </w:tcPr>
+          <w:p>
+            <w:pPr>
+              <w:pStyle w:val="CellText"/>
+              <w:jc w:val="center"/>
+            </w:pPr>
+            <w:r>
+              <w:rPr>
+                <w:b w:val="0"/>
+                <w:sz w:val="14"/>
+              </w:rPr>
+              <w:t>0.917</w:t>
+            </w:r>
+          </w:p>
+        </w:tc>
+        <w:tc>
+          <w:tcPr>
+            <w:tcW w:type="dxa" w:w="1138"/>
+          </w:tcPr>
+          <w:p>
+            <w:pPr>
+              <w:pStyle w:val="CellText"/>
+              <w:jc w:val="center"/>
+            </w:pPr>
+            <w:r>
+              <w:rPr>
+                <w:b w:val="0"/>
+                <w:sz w:val="14"/>
+              </w:rPr>
+              <w:t>1.21 wk</w:t>
+            </w:r>
+          </w:p>
+        </w:tc>
+        <w:tc>
+          <w:tcPr>
+            <w:tcW w:type="dxa" w:w="648"/>
+          </w:tcPr>
+          <w:p>
+            <w:pPr>
+              <w:pStyle w:val="CellText"/>
+              <w:jc w:val="center"/>
+            </w:pPr>
+            <w:r>
+              <w:rPr>
+                <w:b w:val="0"/>
+                <w:sz w:val="14"/>
+              </w:rPr>
+              <w:t>0.910</w:t>
+            </w:r>
+          </w:p>
+        </w:tc>
+        <w:tc>
+          <w:tcPr>
+            <w:tcW w:type="dxa" w:w="1138"/>
+          </w:tcPr>
+          <w:p>
+            <w:pPr>
+              <w:pStyle w:val="CellText"/>
+              <w:jc w:val="center"/>
+            </w:pPr>
+            <w:r>
+              <w:rPr>
+                <w:b w:val="0"/>
+                <w:sz w:val="14"/>
+              </w:rPr>
+              <w:t>1.04 wk</w:t>
+            </w:r>
+          </w:p>
+        </w:tc>
+        <w:tc>
+          <w:tcPr>
+            <w:tcW w:type="dxa" w:w="648"/>
+          </w:tcPr>
+          <w:p>
+            <w:pPr>
+              <w:pStyle w:val="CellText"/>
+              <w:jc w:val="center"/>
+            </w:pPr>
+            <w:r>
+              <w:rPr>
+                <w:b w:val="0"/>
+                <w:sz w:val="14"/>
+              </w:rPr>
+              <w:t>0.908</w:t>
+            </w:r>
+          </w:p>
+        </w:tc>
+        <w:tc>
+          <w:tcPr>
+            <w:tcW w:type="dxa" w:w="1138"/>
+          </w:tcPr>
+          <w:p>
+            <w:pPr>
+              <w:pStyle w:val="CellText"/>
+              <w:jc w:val="center"/>
+            </w:pPr>
+            <w:r>
+              <w:rPr>
+                <w:b w:val="0"/>
+                <w:sz w:val="14"/>
+              </w:rPr>
+              <w:t>1.26 wk</w:t>
+            </w:r>
+          </w:p>
+        </w:tc>
+        <w:tc>
+          <w:tcPr>
+            <w:tcW w:type="dxa" w:w="648"/>
+          </w:tcPr>
+          <w:p>
+            <w:pPr>
+              <w:pStyle w:val="CellText"/>
+              <w:jc w:val="center"/>
+            </w:pPr>
+            <w:r>
+              <w:rPr>
+                <w:b w:val="0"/>
+                <w:sz w:val="14"/>
+              </w:rPr>
+              <w:t>0.940</w:t>
+            </w:r>
+          </w:p>
+        </w:tc>
+        <w:tc>
+          <w:tcPr>
+            <w:tcW w:type="dxa" w:w="1138"/>
+          </w:tcPr>
+          <w:p>
+            <w:pPr>
+              <w:pStyle w:val="CellText"/>
+              <w:jc w:val="center"/>
+            </w:pPr>
+            <w:r>
+              <w:rPr>
+                <w:b w:val="0"/>
+                <w:sz w:val="14"/>
+              </w:rPr>
+              <w:t>2.95 wk</w:t>
+            </w:r>
+          </w:p>
+        </w:tc>
+        <w:tc>
+          <w:tcPr>
+            <w:tcW w:type="dxa" w:w="648"/>
+          </w:tcPr>
+          <w:p>
+            <w:pPr>
+              <w:pStyle w:val="CellText"/>
+              <w:jc w:val="center"/>
+            </w:pPr>
+            <w:r>
+              <w:rPr>
+                <w:b w:val="0"/>
+                <w:sz w:val="14"/>
+              </w:rPr>
+              <w:t>0.884</w:t>
+            </w:r>
+          </w:p>
+        </w:tc>
+        <w:tc>
+          <w:tcPr>
+            <w:tcW w:type="dxa" w:w="1138"/>
+          </w:tcPr>
+          <w:p>
+            <w:pPr>
+              <w:pStyle w:val="CellText"/>
+              <w:jc w:val="center"/>
+            </w:pPr>
+            <w:r>
+              <w:rPr>
+                <w:b w:val="0"/>
+                <w:sz w:val="14"/>
+              </w:rPr>
+              <w:t>1.57 wk</w:t>
+            </w:r>
+          </w:p>
+        </w:tc>
+      </w:tr>
+      <w:tr>
+        <w:tc>
+          <w:tcPr>
+            <w:tcW w:type="dxa" w:w="864"/>
+          </w:tcPr>
+          <w:p>
+            <w:pPr>
+              <w:pStyle w:val="CellText"/>
+              <w:jc w:val="center"/>
+            </w:pPr>
+            <w:r>
+              <w:rPr>
+                <w:b w:val="0"/>
+                <w:sz w:val="14"/>
+              </w:rPr>
+              <w:t>HGB-Q</w:t>
+            </w:r>
+          </w:p>
+        </w:tc>
+        <w:tc>
+          <w:tcPr>
+            <w:tcW w:type="dxa" w:w="648"/>
+          </w:tcPr>
+          <w:p>
+            <w:pPr>
+              <w:pStyle w:val="CellText"/>
+              <w:jc w:val="center"/>
+            </w:pPr>
+            <w:r>
+              <w:rPr>
+                <w:b w:val="0"/>
+                <w:sz w:val="14"/>
+              </w:rPr>
+              <w:t>0.917</w:t>
+            </w:r>
+          </w:p>
+        </w:tc>
+        <w:tc>
+          <w:tcPr>
+            <w:tcW w:type="dxa" w:w="1138"/>
+          </w:tcPr>
+          <w:p>
+            <w:pPr>
+              <w:pStyle w:val="CellText"/>
+              <w:jc w:val="center"/>
+            </w:pPr>
+            <w:r>
+              <w:rPr>
+                <w:b w:val="0"/>
+                <w:sz w:val="14"/>
+              </w:rPr>
+              <w:t>+0.4</w:t>
+              <w:br/>
+            </w:r>
+            <w:r>
+              <w:rPr>
+                <w:b w:val="0"/>
+                <w:sz w:val="14"/>
+              </w:rPr>
+              <w:t>[−0.6,+1.4]</w:t>
+            </w:r>
+          </w:p>
+        </w:tc>
+        <w:tc>
+          <w:tcPr>
+            <w:tcW w:type="dxa" w:w="648"/>
+          </w:tcPr>
+          <w:p>
+            <w:pPr>
+              <w:pStyle w:val="CellText"/>
+              <w:jc w:val="center"/>
+            </w:pPr>
+            <w:r>
+              <w:rPr>
+                <w:b w:val="0"/>
+                <w:sz w:val="14"/>
+              </w:rPr>
+              <w:t>0.912</w:t>
+            </w:r>
+          </w:p>
+        </w:tc>
+        <w:tc>
+          <w:tcPr>
+            <w:tcW w:type="dxa" w:w="1138"/>
+          </w:tcPr>
+          <w:p>
+            <w:pPr>
+              <w:pStyle w:val="CellText"/>
+              <w:jc w:val="center"/>
+            </w:pPr>
+            <w:r>
+              <w:rPr>
+                <w:b w:val="0"/>
+                <w:sz w:val="14"/>
+              </w:rPr>
+              <w:t>+3.5</w:t>
+              <w:br/>
+            </w:r>
+            <w:r>
+              <w:rPr>
+                <w:b w:val="0"/>
+                <w:sz w:val="14"/>
+              </w:rPr>
+              <w:t>[+2.8,+4.2]</w:t>
+            </w:r>
+          </w:p>
+        </w:tc>
+        <w:tc>
+          <w:tcPr>
+            <w:tcW w:type="dxa" w:w="648"/>
+          </w:tcPr>
+          <w:p>
+            <w:pPr>
+              <w:pStyle w:val="CellText"/>
+              <w:jc w:val="center"/>
+            </w:pPr>
+            <w:r>
+              <w:rPr>
+                <w:b w:val="0"/>
+                <w:sz w:val="14"/>
+              </w:rPr>
+              <w:t>0.906</w:t>
+            </w:r>
+          </w:p>
+        </w:tc>
+        <w:tc>
+          <w:tcPr>
+            <w:tcW w:type="dxa" w:w="1138"/>
+          </w:tcPr>
+          <w:p>
+            <w:pPr>
+              <w:pStyle w:val="CellText"/>
+              <w:jc w:val="center"/>
+            </w:pPr>
+            <w:r>
+              <w:rPr>
+                <w:b w:val="0"/>
+                <w:sz w:val="14"/>
+              </w:rPr>
+              <w:t>−1.2</w:t>
+              <w:br/>
+            </w:r>
+            <w:r>
+              <w:rPr>
+                <w:b w:val="0"/>
+                <w:sz w:val="14"/>
+              </w:rPr>
+              <w:t>[−4.5,+1.5]</w:t>
+            </w:r>
+          </w:p>
+        </w:tc>
+        <w:tc>
+          <w:tcPr>
+            <w:tcW w:type="dxa" w:w="648"/>
+          </w:tcPr>
+          <w:p>
+            <w:pPr>
+              <w:pStyle w:val="CellText"/>
+              <w:jc w:val="center"/>
+            </w:pPr>
+            <w:r>
+              <w:rPr>
+                <w:b w:val="0"/>
+                <w:sz w:val="14"/>
+              </w:rPr>
+              <w:t>0.939</w:t>
+            </w:r>
+          </w:p>
+        </w:tc>
+        <w:tc>
+          <w:tcPr>
+            <w:tcW w:type="dxa" w:w="1138"/>
+          </w:tcPr>
+          <w:p>
+            <w:pPr>
+              <w:pStyle w:val="CellText"/>
+              <w:jc w:val="center"/>
+            </w:pPr>
+            <w:r>
+              <w:rPr>
+                <w:b w:val="0"/>
+                <w:sz w:val="14"/>
+              </w:rPr>
+              <w:t>+3.9</w:t>
+              <w:br/>
+            </w:r>
+            <w:r>
+              <w:rPr>
+                <w:b w:val="0"/>
+                <w:sz w:val="14"/>
+              </w:rPr>
+              <w:t>[−3.1,+11.1]</w:t>
+            </w:r>
+          </w:p>
+        </w:tc>
+        <w:tc>
+          <w:tcPr>
+            <w:tcW w:type="dxa" w:w="648"/>
+          </w:tcPr>
+          <w:p>
+            <w:pPr>
+              <w:pStyle w:val="CellText"/>
+              <w:jc w:val="center"/>
+            </w:pPr>
+            <w:r>
+              <w:rPr>
+                <w:b w:val="0"/>
+                <w:sz w:val="14"/>
+              </w:rPr>
+              <w:t>0.877</w:t>
+            </w:r>
+          </w:p>
+        </w:tc>
+        <w:tc>
+          <w:tcPr>
+            <w:tcW w:type="dxa" w:w="1138"/>
+          </w:tcPr>
+          <w:p>
+            <w:pPr>
+              <w:pStyle w:val="CellText"/>
+              <w:jc w:val="center"/>
+            </w:pPr>
+            <w:r>
+              <w:rPr>
+                <w:b w:val="0"/>
+                <w:sz w:val="14"/>
+              </w:rPr>
+              <w:t>−8.8†</w:t>
+              <w:br/>
+            </w:r>
+            <w:r>
+              <w:rPr>
+                <w:b w:val="0"/>
+                <w:sz w:val="14"/>
+              </w:rPr>
+              <w:t>[−10.8,−6.2]</w:t>
+            </w:r>
+          </w:p>
+        </w:tc>
+      </w:tr>
+      <w:tr>
+        <w:tc>
+          <w:tcPr>
+            <w:tcW w:type="dxa" w:w="864"/>
+          </w:tcPr>
+          <w:p>
+            <w:pPr>
+              <w:pStyle w:val="CellText"/>
+              <w:jc w:val="center"/>
+            </w:pPr>
+            <w:r>
+              <w:rPr>
+                <w:b w:val="0"/>
+                <w:sz w:val="14"/>
+              </w:rPr>
+              <w:t>TSB-NB</w:t>
+            </w:r>
+          </w:p>
+        </w:tc>
+        <w:tc>
+          <w:tcPr>
+            <w:tcW w:type="dxa" w:w="648"/>
+          </w:tcPr>
+          <w:p>
+            <w:pPr>
+              <w:pStyle w:val="CellText"/>
+              <w:jc w:val="center"/>
+            </w:pPr>
+            <w:r>
+              <w:rPr>
+                <w:b w:val="0"/>
+                <w:sz w:val="14"/>
+              </w:rPr>
+              <w:t>0.926</w:t>
+            </w:r>
+          </w:p>
+        </w:tc>
+        <w:tc>
+          <w:tcPr>
+            <w:tcW w:type="dxa" w:w="1138"/>
+          </w:tcPr>
+          <w:p>
+            <w:pPr>
+              <w:pStyle w:val="CellText"/>
+              <w:jc w:val="center"/>
+            </w:pPr>
+            <w:r>
+              <w:rPr>
+                <w:b w:val="0"/>
+                <w:sz w:val="14"/>
+              </w:rPr>
+              <w:t>+14.2†</w:t>
+              <w:br/>
+            </w:r>
+            <w:r>
+              <w:rPr>
+                <w:b w:val="0"/>
+                <w:sz w:val="14"/>
+              </w:rPr>
+              <w:t>[+9.1,+20.6]</w:t>
+            </w:r>
+          </w:p>
+        </w:tc>
+        <w:tc>
+          <w:tcPr>
+            <w:tcW w:type="dxa" w:w="648"/>
+          </w:tcPr>
+          <w:p>
+            <w:pPr>
+              <w:pStyle w:val="CellText"/>
+              <w:jc w:val="center"/>
+            </w:pPr>
+            <w:r>
+              <w:rPr>
+                <w:b w:val="0"/>
+                <w:sz w:val="14"/>
+              </w:rPr>
+              <w:t>0.906</w:t>
+            </w:r>
+          </w:p>
+        </w:tc>
+        <w:tc>
+          <w:tcPr>
+            <w:tcW w:type="dxa" w:w="1138"/>
+          </w:tcPr>
+          <w:p>
+            <w:pPr>
+              <w:pStyle w:val="CellText"/>
+              <w:jc w:val="center"/>
+            </w:pPr>
+            <w:r>
+              <w:rPr>
+                <w:b w:val="0"/>
+                <w:sz w:val="14"/>
+              </w:rPr>
+              <w:t>+6.1</w:t>
+              <w:br/>
+            </w:r>
+            <w:r>
+              <w:rPr>
+                <w:b w:val="0"/>
+                <w:sz w:val="14"/>
+              </w:rPr>
+              <w:t>[+4.0,+8.8]</w:t>
+            </w:r>
+          </w:p>
+        </w:tc>
+        <w:tc>
+          <w:tcPr>
+            <w:tcW w:type="dxa" w:w="648"/>
+          </w:tcPr>
+          <w:p>
+            <w:pPr>
+              <w:pStyle w:val="CellText"/>
+              <w:jc w:val="center"/>
+            </w:pPr>
+            <w:r>
+              <w:rPr>
+                <w:b w:val="0"/>
+                <w:sz w:val="14"/>
+              </w:rPr>
+              <w:t>0.908</w:t>
+            </w:r>
+          </w:p>
+        </w:tc>
+        <w:tc>
+          <w:tcPr>
+            <w:tcW w:type="dxa" w:w="1138"/>
+          </w:tcPr>
+          <w:p>
+            <w:pPr>
+              <w:pStyle w:val="CellText"/>
+              <w:jc w:val="center"/>
+            </w:pPr>
+            <w:r>
+              <w:rPr>
+                <w:b w:val="0"/>
+                <w:sz w:val="14"/>
+              </w:rPr>
+              <w:t>+33.3</w:t>
+              <w:br/>
+            </w:r>
+            <w:r>
+              <w:rPr>
+                <w:b w:val="0"/>
+                <w:sz w:val="14"/>
+              </w:rPr>
+              <w:t>[+7.6,+61.6]</w:t>
+            </w:r>
+          </w:p>
+        </w:tc>
+        <w:tc>
+          <w:tcPr>
+            <w:tcW w:type="dxa" w:w="648"/>
+          </w:tcPr>
+          <w:p>
+            <w:pPr>
+              <w:pStyle w:val="CellText"/>
+              <w:jc w:val="center"/>
+            </w:pPr>
+            <w:r>
+              <w:rPr>
+                <w:b w:val="0"/>
+                <w:sz w:val="14"/>
+              </w:rPr>
+              <w:t>0.922</w:t>
+            </w:r>
+          </w:p>
+        </w:tc>
+        <w:tc>
+          <w:tcPr>
+            <w:tcW w:type="dxa" w:w="1138"/>
+          </w:tcPr>
+          <w:p>
+            <w:pPr>
+              <w:pStyle w:val="CellText"/>
+              <w:jc w:val="center"/>
+            </w:pPr>
+            <w:r>
+              <w:rPr>
+                <w:b w:val="0"/>
+                <w:sz w:val="14"/>
+              </w:rPr>
+              <w:t>+28.3†</w:t>
+              <w:br/>
+            </w:r>
+            <w:r>
+              <w:rPr>
+                <w:b w:val="0"/>
+                <w:sz w:val="14"/>
+              </w:rPr>
+              <w:t>[−49.9,+73.7]</w:t>
+            </w:r>
+          </w:p>
+        </w:tc>
+        <w:tc>
+          <w:tcPr>
+            <w:tcW w:type="dxa" w:w="648"/>
+          </w:tcPr>
+          <w:p>
+            <w:pPr>
+              <w:pStyle w:val="CellText"/>
+              <w:jc w:val="center"/>
+            </w:pPr>
+            <w:r>
+              <w:rPr>
+                <w:b w:val="0"/>
+                <w:sz w:val="14"/>
+              </w:rPr>
+              <w:t>0.865</w:t>
+            </w:r>
+          </w:p>
+        </w:tc>
+        <w:tc>
+          <w:tcPr>
+            <w:tcW w:type="dxa" w:w="1138"/>
+          </w:tcPr>
+          <w:p>
+            <w:pPr>
+              <w:pStyle w:val="CellText"/>
+              <w:jc w:val="center"/>
+            </w:pPr>
+            <w:r>
+              <w:rPr>
+                <w:b w:val="0"/>
+                <w:sz w:val="14"/>
+              </w:rPr>
+              <w:t>+5.9†</w:t>
+              <w:br/>
+            </w:r>
+            <w:r>
+              <w:rPr>
+                <w:b w:val="0"/>
+                <w:sz w:val="14"/>
+              </w:rPr>
+              <w:t>[−1.6,+14.8]</w:t>
+            </w:r>
+          </w:p>
+        </w:tc>
+      </w:tr>
+      <w:tr>
+        <w:tc>
+          <w:tcPr>
+            <w:tcW w:type="dxa" w:w="864"/>
+          </w:tcPr>
+          <w:p>
+            <w:pPr>
+              <w:pStyle w:val="CellText"/>
+              <w:jc w:val="center"/>
+            </w:pPr>
+            <w:r>
+              <w:rPr>
+                <w:b w:val="0"/>
+                <w:sz w:val="14"/>
+              </w:rPr>
+              <w:t>C2</w:t>
+            </w:r>
+          </w:p>
+        </w:tc>
+        <w:tc>
+          <w:tcPr>
+            <w:tcW w:type="dxa" w:w="648"/>
+          </w:tcPr>
+          <w:p>
+            <w:pPr>
+              <w:pStyle w:val="CellText"/>
+              <w:jc w:val="center"/>
+            </w:pPr>
+            <w:r>
+              <w:rPr>
+                <w:b w:val="0"/>
+                <w:sz w:val="14"/>
+              </w:rPr>
+              <w:t>0.921</w:t>
+            </w:r>
+          </w:p>
+        </w:tc>
+        <w:tc>
+          <w:tcPr>
+            <w:tcW w:type="dxa" w:w="1138"/>
+          </w:tcPr>
+          <w:p>
+            <w:pPr>
+              <w:pStyle w:val="CellText"/>
+              <w:jc w:val="center"/>
+            </w:pPr>
+            <w:r>
+              <w:rPr>
+                <w:b w:val="0"/>
+                <w:sz w:val="14"/>
+              </w:rPr>
+              <w:t>+2.8</w:t>
+              <w:br/>
+            </w:r>
+            <w:r>
+              <w:rPr>
+                <w:b w:val="0"/>
+                <w:sz w:val="14"/>
+              </w:rPr>
+              <w:t>[+1.1,+5.1]</w:t>
+            </w:r>
+          </w:p>
+        </w:tc>
+        <w:tc>
+          <w:tcPr>
+            <w:tcW w:type="dxa" w:w="648"/>
+          </w:tcPr>
+          <w:p>
+            <w:pPr>
+              <w:pStyle w:val="CellText"/>
+              <w:jc w:val="center"/>
+            </w:pPr>
+            <w:r>
+              <w:rPr>
+                <w:b w:val="0"/>
+                <w:sz w:val="14"/>
+              </w:rPr>
+              <w:t>0.908</w:t>
+            </w:r>
+          </w:p>
+        </w:tc>
+        <w:tc>
+          <w:tcPr>
+            <w:tcW w:type="dxa" w:w="1138"/>
+          </w:tcPr>
+          <w:p>
+            <w:pPr>
+              <w:pStyle w:val="CellText"/>
+              <w:jc w:val="center"/>
+            </w:pPr>
+            <w:r>
+              <w:rPr>
+                <w:b w:val="0"/>
+                <w:sz w:val="14"/>
+              </w:rPr>
+              <w:t>−0.4</w:t>
+              <w:br/>
+            </w:r>
+            <w:r>
+              <w:rPr>
+                <w:b w:val="0"/>
+                <w:sz w:val="14"/>
+              </w:rPr>
+              <w:t>[−1.4,+0.7]</w:t>
+            </w:r>
+          </w:p>
+        </w:tc>
+        <w:tc>
+          <w:tcPr>
+            <w:tcW w:type="dxa" w:w="648"/>
+          </w:tcPr>
+          <w:p>
+            <w:pPr>
+              <w:pStyle w:val="CellText"/>
+              <w:jc w:val="center"/>
+            </w:pPr>
+            <w:r>
+              <w:rPr>
+                <w:b w:val="0"/>
+                <w:sz w:val="14"/>
+              </w:rPr>
+              <w:t>0.907</w:t>
+            </w:r>
+          </w:p>
+        </w:tc>
+        <w:tc>
+          <w:tcPr>
+            <w:tcW w:type="dxa" w:w="1138"/>
+          </w:tcPr>
+          <w:p>
+            <w:pPr>
+              <w:pStyle w:val="CellText"/>
+              <w:jc w:val="center"/>
+            </w:pPr>
+            <w:r>
+              <w:rPr>
+                <w:b w:val="0"/>
+                <w:sz w:val="14"/>
+              </w:rPr>
+              <w:t>−7.4</w:t>
+              <w:br/>
+            </w:r>
+            <w:r>
+              <w:rPr>
+                <w:b w:val="0"/>
+                <w:sz w:val="14"/>
+              </w:rPr>
+              <w:t>[−15.3,−1.9]</w:t>
+            </w:r>
+          </w:p>
+        </w:tc>
+        <w:tc>
+          <w:tcPr>
+            <w:tcW w:type="dxa" w:w="648"/>
+          </w:tcPr>
+          <w:p>
+            <w:pPr>
+              <w:pStyle w:val="CellText"/>
+              <w:jc w:val="center"/>
+            </w:pPr>
+            <w:r>
+              <w:rPr>
+                <w:b w:val="0"/>
+                <w:sz w:val="14"/>
+              </w:rPr>
+              <w:t>0.936</w:t>
+            </w:r>
+          </w:p>
+        </w:tc>
+        <w:tc>
+          <w:tcPr>
+            <w:tcW w:type="dxa" w:w="1138"/>
+          </w:tcPr>
+          <w:p>
+            <w:pPr>
+              <w:pStyle w:val="CellText"/>
+              <w:jc w:val="center"/>
+            </w:pPr>
+            <w:r>
+              <w:rPr>
+                <w:b w:val="0"/>
+                <w:sz w:val="14"/>
+              </w:rPr>
+              <w:t>+18.8</w:t>
+              <w:br/>
+            </w:r>
+            <w:r>
+              <w:rPr>
+                <w:b w:val="0"/>
+                <w:sz w:val="14"/>
+              </w:rPr>
+              <w:t>[−35.2,+37.4]</w:t>
+            </w:r>
+          </w:p>
+        </w:tc>
+        <w:tc>
+          <w:tcPr>
+            <w:tcW w:type="dxa" w:w="648"/>
+          </w:tcPr>
+          <w:p>
+            <w:pPr>
+              <w:pStyle w:val="CellText"/>
+              <w:jc w:val="center"/>
+            </w:pPr>
+            <w:r>
+              <w:rPr>
+                <w:b w:val="0"/>
+                <w:sz w:val="14"/>
+              </w:rPr>
+              <w:t>0.875</w:t>
+            </w:r>
+          </w:p>
+        </w:tc>
+        <w:tc>
+          <w:tcPr>
+            <w:tcW w:type="dxa" w:w="1138"/>
+          </w:tcPr>
+          <w:p>
+            <w:pPr>
+              <w:pStyle w:val="CellText"/>
+              <w:jc w:val="center"/>
+            </w:pPr>
+            <w:r>
+              <w:rPr>
+                <w:b w:val="0"/>
+                <w:sz w:val="14"/>
+              </w:rPr>
+              <w:t>+0.1†</w:t>
+              <w:br/>
+            </w:r>
+            <w:r>
+              <w:rPr>
+                <w:b w:val="0"/>
+                <w:sz w:val="14"/>
+              </w:rPr>
+              <w:t>[−3.7,+4.5]</w:t>
+            </w:r>
+          </w:p>
+        </w:tc>
+      </w:tr>
+      <w:tr>
+        <w:tc>
+          <w:tcPr>
+            <w:tcW w:type="dxa" w:w="864"/>
+          </w:tcPr>
+          <w:p>
+            <w:pPr>
+              <w:pStyle w:val="CellText"/>
+              <w:jc w:val="center"/>
+            </w:pPr>
+            <w:r>
+              <w:rPr>
+                <w:b w:val="0"/>
+                <w:sz w:val="14"/>
+              </w:rPr>
+              <w:t>E7-med</w:t>
+            </w:r>
+          </w:p>
+        </w:tc>
+        <w:tc>
+          <w:tcPr>
+            <w:tcW w:type="dxa" w:w="648"/>
+          </w:tcPr>
+          <w:p>
+            <w:pPr>
+              <w:pStyle w:val="CellText"/>
+              <w:jc w:val="center"/>
+            </w:pPr>
+            <w:r>
+              <w:rPr>
+                <w:b w:val="0"/>
+                <w:sz w:val="14"/>
+              </w:rPr>
+              <w:t>0.918</w:t>
+            </w:r>
+          </w:p>
+        </w:tc>
+        <w:tc>
+          <w:tcPr>
+            <w:tcW w:type="dxa" w:w="1138"/>
+          </w:tcPr>
+          <w:p>
+            <w:pPr>
+              <w:pStyle w:val="CellText"/>
+              <w:jc w:val="center"/>
+            </w:pPr>
+            <w:r>
+              <w:rPr>
+                <w:b w:val="0"/>
+                <w:sz w:val="14"/>
+              </w:rPr>
+              <w:t>+1.1</w:t>
+              <w:br/>
+            </w:r>
+            <w:r>
+              <w:rPr>
+                <w:b w:val="0"/>
+                <w:sz w:val="14"/>
+              </w:rPr>
+              <w:t>[+0.2,+2.1]</w:t>
+            </w:r>
+          </w:p>
+        </w:tc>
+        <w:tc>
+          <w:tcPr>
+            <w:tcW w:type="dxa" w:w="648"/>
+          </w:tcPr>
+          <w:p>
+            <w:pPr>
+              <w:pStyle w:val="CellText"/>
+              <w:jc w:val="center"/>
+            </w:pPr>
+            <w:r>
+              <w:rPr>
+                <w:b w:val="0"/>
+                <w:sz w:val="14"/>
+              </w:rPr>
+              <w:t>0.908</w:t>
+            </w:r>
+          </w:p>
+        </w:tc>
+        <w:tc>
+          <w:tcPr>
+            <w:tcW w:type="dxa" w:w="1138"/>
+          </w:tcPr>
+          <w:p>
+            <w:pPr>
+              <w:pStyle w:val="CellText"/>
+              <w:jc w:val="center"/>
+            </w:pPr>
+            <w:r>
+              <w:rPr>
+                <w:b w:val="0"/>
+                <w:sz w:val="14"/>
+              </w:rPr>
+              <w:t>−0.9</w:t>
+              <w:br/>
+            </w:r>
+            <w:r>
+              <w:rPr>
+                <w:b w:val="0"/>
+                <w:sz w:val="14"/>
+              </w:rPr>
+              <w:t>[−1.9,+0.1]</w:t>
+            </w:r>
+          </w:p>
+        </w:tc>
+        <w:tc>
+          <w:tcPr>
+            <w:tcW w:type="dxa" w:w="648"/>
+          </w:tcPr>
+          <w:p>
+            <w:pPr>
+              <w:pStyle w:val="CellText"/>
+              <w:jc w:val="center"/>
+            </w:pPr>
+            <w:r>
+              <w:rPr>
+                <w:b w:val="0"/>
+                <w:sz w:val="14"/>
+              </w:rPr>
+              <w:t>0.907</w:t>
+            </w:r>
+          </w:p>
+        </w:tc>
+        <w:tc>
+          <w:tcPr>
+            <w:tcW w:type="dxa" w:w="1138"/>
+          </w:tcPr>
+          <w:p>
+            <w:pPr>
+              <w:pStyle w:val="CellText"/>
+              <w:jc w:val="center"/>
+            </w:pPr>
+            <w:r>
+              <w:rPr>
+                <w:b w:val="0"/>
+                <w:sz w:val="14"/>
+              </w:rPr>
+              <w:t>−1.1</w:t>
+              <w:br/>
+            </w:r>
+            <w:r>
+              <w:rPr>
+                <w:b w:val="0"/>
+                <w:sz w:val="14"/>
+              </w:rPr>
+              <w:t>[−12.9,+9.2]</w:t>
+            </w:r>
+          </w:p>
+        </w:tc>
+        <w:tc>
+          <w:tcPr>
+            <w:tcW w:type="dxa" w:w="648"/>
+          </w:tcPr>
+          <w:p>
+            <w:pPr>
+              <w:pStyle w:val="CellText"/>
+              <w:jc w:val="center"/>
+            </w:pPr>
+            <w:r>
+              <w:rPr>
+                <w:b w:val="0"/>
+                <w:sz w:val="14"/>
+              </w:rPr>
+              <w:t>0.928</w:t>
+            </w:r>
+          </w:p>
+        </w:tc>
+        <w:tc>
+          <w:tcPr>
+            <w:tcW w:type="dxa" w:w="1138"/>
+          </w:tcPr>
+          <w:p>
+            <w:pPr>
+              <w:pStyle w:val="CellText"/>
+              <w:jc w:val="center"/>
+            </w:pPr>
+            <w:r>
+              <w:rPr>
+                <w:b w:val="0"/>
+                <w:sz w:val="14"/>
+              </w:rPr>
+              <w:t>+9.6†</w:t>
+              <w:br/>
+            </w:r>
+            <w:r>
+              <w:rPr>
+                <w:b w:val="0"/>
+                <w:sz w:val="14"/>
+              </w:rPr>
+              <w:t>[−49.6,+28.1]</w:t>
+            </w:r>
+          </w:p>
+        </w:tc>
+        <w:tc>
+          <w:tcPr>
+            <w:tcW w:type="dxa" w:w="648"/>
+          </w:tcPr>
+          <w:p>
+            <w:pPr>
+              <w:pStyle w:val="CellText"/>
+              <w:jc w:val="center"/>
+            </w:pPr>
+            <w:r>
+              <w:rPr>
+                <w:b w:val="0"/>
+                <w:sz w:val="14"/>
+              </w:rPr>
+              <w:t>0.893</w:t>
+            </w:r>
+          </w:p>
+        </w:tc>
+        <w:tc>
+          <w:tcPr>
+            <w:tcW w:type="dxa" w:w="1138"/>
+          </w:tcPr>
+          <w:p>
+            <w:pPr>
+              <w:pStyle w:val="CellText"/>
+              <w:jc w:val="center"/>
+            </w:pPr>
+            <w:r>
+              <w:rPr>
+                <w:b w:val="0"/>
+                <w:sz w:val="14"/>
+              </w:rPr>
+              <w:t>+6.0†</w:t>
+              <w:br/>
+            </w:r>
+            <w:r>
+              <w:rPr>
+                <w:b w:val="0"/>
+                <w:sz w:val="14"/>
+              </w:rPr>
+              <w:t>[+3.6,+8.7]</w:t>
+            </w:r>
+          </w:p>
+        </w:tc>
+      </w:tr>
+    </w:tbl>
+    <w:p>
+      <w:pPr>
         <w:pStyle w:val="Heading1"/>
+        <w:keepNext/>
       </w:pPr>
       <w:r>
         <w:t>6  DISCUSSION</w:t>
       </w:r>
     </w:p>
     <w:p>
-      <w:pPr/>
+      <w:pPr>
+        <w:widowControl/>
+      </w:pPr>
       <w:r>
-        <w:t>Forecast methods should be compared at the same realised service outcome, not merely at a common nominal quantile level. On M5, setting τ = 0.90 produces fill rates from 0.935 to 0.967 across methods, reflecting calibration differences. Rankings at equal τ therefore need not measure the inventory required for equivalent service. The variation in VN1 method rankings across the three windows likewise indicates that results from a single evaluation period may not transfer to adjacent periods, consistent with the concern raised by Theodorou et al. [7].</w:t>
+        <w:t>The comparison metric changes what counts as a good forecast. With τ fixed at 0.90, the seven methods achieve M5 fill rates ranging from 0.935 to 0.967. Equal nominal quantiles are therefore not equal service outcomes. Matching realised fill rate allows stock requirements to be compared on the same basis. The VN1 window-to-window reversals also show why an inventory ranking based on a single test period may not hold in the next one [7]. Matching realised fill sets τ with the test outcomes, whereas a deployed system must fix it beforehand; on VN1 and the footwear panel the achieved fill then misses the target by up to 5.5 points, so retrospective savings do not become reliable stock reductions, and a ranking should not be transferred without a prospective check.</w:t>
       </w:r>
     </w:p>
     <w:p>
-      <w:pPr/>
+      <w:pPr>
+        <w:widowControl/>
+      </w:pPr>
       <w:r>
-        <w:t>On VN1, inventory performance is associated with realised demand changes. TSB-NB requires less inventory for the stable-demand subset, while LGB-Q achieves a fill rate of 0.92 on growing-demand series in two windows where TSB-NB does not. Theodorou et al. [7] also report divergence between accuracy and inventory costs, particularly when lost sales are heavily penalised. Our comparisons show that the inventory ranking can additionally change across periods and that this behaviour is not observed on M5 at the fill rates examined here. A hypothetical rule with advance knowledge of which series will grow would require 5.6–9.8% less inventory than LGB-Q on VN1. A classifier trained on pre-test features retrieves part of this advantage but produces unstable results (see repository); the ex-post classification itself cannot support a deployable decision rule.</w:t>
+        <w:t>On VN1, the retrospective demand split helps describe these reversals. TSB-NB uses less stock for stable-demand series, whereas LGB-Q reaches fill rate 0.92 on growing-demand series in two windows where TSB-NB cannot. Theodorou et al. [7] similarly find cases in which forecast accuracy and inventory cost favour different methods, though under different service and cost settings. If future demand growth were known in advance, assigning LGB-Q to growing series and TSB-NB to the rest would reduce inventory by 5.6–9.8% relative to LGB-Q on VN1. At warehouse level, pre-test features carry some information on the reversals: fitted on an earlier window, they rank the TSB-NB/LGB-Q inventory ratio of the next window with Spearman ρ of 0.21–0.27 (permutation p ≤ 0.046), but assigning TSB-NB to the warehouses they favour changes VN1 inventory by −9.4%, −0.2% and +2.9% across three train–test splits, so the signal does not yield a reliable selection rule.</w:t>
       </w:r>
     </w:p>
     <w:p>
-      <w:pPr/>
+      <w:pPr>
+        <w:widowControl/>
+      </w:pPr>
       <w:r>
-        <w:t>Direct quantile estimation is relevant to the comparison. At a fill rate of 0.94 on M5, the point-forecast-plus-safety-stock and conformal approaches (LGB-T and LGB-C) require 3.3–8.2% more inventory than directly estimated LightGBM quantiles. Differences in forecast construction and aggregation level may contribute to contrasts with [7], which used empirical residual quantiles, and with the daily simulation in [23], where empirical methods performed well. These studies do not isolate those factors, so the comparison should not be treated as a causal explanation.</w:t>
+        <w:t>Adaptive updating. Parameters are re-estimated only every 13 weeks with fixed hyperparameters, which can leave the global models a block behind level shifts on fast-growing VN1 series. More frequent or warm-started refits, recency weighting or re-tuning could reduce that lag but were not tested.</w:t>
       </w:r>
     </w:p>
     <w:p>
-      <w:pPr/>
+      <w:pPr>
+        <w:widowControl/>
+      </w:pPr>
       <w:r>
-        <w:t>Across the six dataset–window runs, C2 has the lowest reported maximum regret under the specified metric. Regret is defined for each run as excess inventory over the best single method, averaged across the fill-rate targets a method reaches. The maximum is 0.9% for C2, compared with 9.4% for LGB-Q, 9.5% for LGB-T (which does not reach the highest fill-rate targets in any run), 11.4% for HGB-Q, and 20.7% for TSB-NB. When a lost sale is valued at no more than 200 weeks of holding cost, C2 stays within 3.1% of the cheapest single model in each run. With higher lost-sales penalties, all methods operate at τ = 0.99; LGB-Q then attains the highest fill rate, and C2 can cost up to 29% more. Because C2 was selected after examining the same experiments, these descriptive regret figures should not be interpreted as prospective performance guarantees.</w:t>
+        <w:t>How the quantiles are constructed also matters: on M5 at fill rate 0.94, LGB-T and LGB-C need 3.3–8.2% more inventory than directly estimated LightGBM quantiles. Different quantile construction may explain part of the disagreement with [7] and [23].</w:t>
       </w:r>
     </w:p>
     <w:p>
-      <w:pPr/>
+      <w:pPr>
+        <w:widowControl/>
+      </w:pPr>
       <w:r>
-        <w:t>Limitations. Recorded sales proxy demand, and historical stockouts cannot be identified. Hyperparameters are not tuned, although the reported M5 comparisons persist under four LightGBM settings. Lead times of one and four weeks were examined only in the main window. Demand-growth groups are defined ex post. The bootstrap intervals resample series rather than periods, and only three windows are evaluated per dataset. Differences between datasets also limit generalisation to other retailers. A supplementary repository experiment reports that zero-shot Chronos-2 [22] has lower accuracy than LGB-Q on 69–73% of VN1 series and is not the most inventory-efficient method; this result is not part of the seven-method main benchmark.</w:t>
+        <w:t>Among the combinations, E7-med has the smallest maximum regret under the paper's descriptive metric (excess stock over the best single method, averaged over attainable targets): 0.3% across six runs, versus 0.9% for the post hoc C2, 3.4% for E7, 9.4% for LGB-Q, 9.5% for LGB-T, 11.4% for HGB-Q and 20.7% for TSB-NB. These figures describe the six evaluated runs, not expected deployment performance.</w:t>
+      </w:r>
+    </w:p>
+    <w:p>
+      <w:pPr>
+        <w:widowControl/>
+      </w:pPr>
+      <w:r>
+        <w:t>Toward deployment. Because neither combination showed a reliable advantage in Section 5.8, LGB-Q is the safer default, and retrospective savings alone do not justify a switch. A candidate should be frozen and run in shadow mode beside it for several review cycles, with achieved fill and upper-quantile coverage monitored, where TSB-NB under-covers.</w:t>
+      </w:r>
+    </w:p>
+    <w:p>
+      <w:pPr>
+        <w:widowControl/>
+      </w:pPr>
+      <w:r>
+        <w:t>Censored demand. Both datasets record sales, not demand, and contain no on-hand records. A sales-only detector that flags zero runs between two sales whose probability under the series' sale frequency p is below 1% ((1 − p)^k &lt; 0.01) marks 7.4–9.0% of M5 and 6.1–6.9% of VN1 test weeks as suspected stockouts; because genuine pauses in demand are also flagged, these are upper bounds. Restricting the evaluation to the 72–82% of series without flagged weeks leaves the leading method of every window and C2's lowest maximum regret unchanged. A stricter scenario imputes each series' mean weekly sales in every flagged week. TSB-NB, whose occurrence probability falls during zero runs, then needs 17–27% more inventory than LGB-Q on M5 at fill rate 0.92; the leading method changes in three of six windows, always to a closely ranked method; and C2's maximum regret rises to 9.8%, although it still needs 6.9–10.7% less inventory than LGB-Q on VN1. The pre-specified E7-med is less sensitive: its maximum regret is 0.1% on the clean subset and −2.2% under imputation, where it needs 2.9–5.6% less M5 and 9.5–14.7% less VN1 inventory than LGB-Q at fill rate 0.92. Across detector thresholds of 0.001–0.1 and imputing half the mean, the mean or the mean positive sales, TSB-NB needs 11.8–34.2% more inventory than LGB-Q on M5, while E7-med needs 1.4–7.2% (M5) and 8.2–15.9% (VN1) less and keeps a maximum regret of at most 1.6%. Stock-availability records would be needed to settle these effects. Censoring could also be handled in training, treating flagged weeks as missing or right-censored with an expectation–maximisation step or a censored likelihood [28], censored quantile regression [29] or a survival model of the time between sales; we leave this to future work.</w:t>
+      </w:r>
+    </w:p>
+    <w:p>
+      <w:pPr>
+        <w:widowControl/>
+      </w:pPr>
+      <w:r>
+        <w:t>Limitations. Recorded sales stand in for demand, and stockouts are only inferred (see above). We did not tune hyperparameters; the M5 comparison persists across four LightGBM settings, but VN1 is sensitive to one of them (Section 5.8). Growth groups are formed retrospectively. Series-level intervals are too narrow on VN1, where warehouse- and client-level resampling widens them (Section 5.8), and M5 and VN1 supply three evaluation windows, the footwear panel one. Chronos-2 [22] ran zero-shot only. Nabil et al. [27] forecast spare-part demand with a two-stage LightGBM/XGBoost model (an occurrence classifier times a size regressor) and set stock with a normal safety factor; a quantile version of this design is not tested here.</w:t>
       </w:r>
     </w:p>
     <w:p>
       <w:pPr>
         <w:pStyle w:val="Heading1"/>
+        <w:keepNext/>
       </w:pPr>
       <w:r>
         <w:t>7  CONCLUSION</w:t>
       </w:r>
     </w:p>
     <w:p>
-      <w:pPr/>
+      <w:pPr>
+        <w:widowControl/>
+      </w:pPr>
       <w:r>
-        <w:t>We compared seven probabilistic forecasting methods under one replenishment and liquidation policy on M5 and VN1 over three 26-week test windows. On M5, LightGBM quantile regression (LGB-Q) has the lowest volume-weighted quantile loss and requires 3–11% less inventory than point forecasts with safety stock, conformal quantiles, TSB-NB, and exponential smoothing at a realised fill rate of 0.94 in all three windows.</w:t>
+        <w:t>For RQ1, rankings by accuracy and by inventory agree on M5 but not on VN1. Under the weekly order-up-to policy tested here, LGB-Q has the lowest volume-weighted quantile loss on M5 and needs 3–11% less inventory than the statistical and point-based alternatives at a realised fill rate of 0.94 in all three windows, across the lead-time checks and four LightGBM configurations. On VN1 no single method leads across periods, and neither demand classes, clusters nor pre-test warehouse features select one reliably in advance.</w:t>
       </w:r>
     </w:p>
     <w:p>
-      <w:pPr/>
+      <w:pPr>
+        <w:widowControl/>
+      </w:pPr>
       <w:r>
-        <w:t>On VN1, method rankings differ across windows. TSB-NB uses less inventory for stable-demand series, whereas LGB-Q reaches the evaluated fill-rate target for growing-demand series in two windows where TSB-NB does not. Neither ADI–CV² grouping nor the tested unsupervised segmentation consistently improves prospective method selection. A post hoc equal-weight average of LGB-Q and TSB-NB quantiles requires 6–11% less inventory than LGB-Q on VN1 at a fill rate of 0.92 and remains within 1.5% on M5. This result needs independent validation because the model pair was selected after the component results were examined.</w:t>
+        <w:t>For RQ2, the results expose a gap between retrospective inventory efficiency and prospective reliability. At matched realised fill, a pre-specified median of all seven methods needs 7–8% less VN1 inventory than LGB-Q, and the post hoc LGB-Q/TSB-NB average 6–11%, while both stay within 1.6% on M5. These retrospective advantages do not generalise consistently under past-only service calibration, full-policy cluster bootstrapping and independent footwear validation. Although C2 retains a significant inventory advantage in one prospective VN1 comparison, neither combination demonstrates a reliable benefit across settings. LGB-Q therefore remains the more defensible reference method under the tested policy.</w:t>
       </w:r>
     </w:p>
     <w:p>
-      <w:pPr/>
+      <w:pPr>
+        <w:widowControl/>
+      </w:pPr>
       <w:r>
-        <w:t>Quantile-based liquidation reduces inventory on VN1 with changes in fill rate of no more than 0.02 percentage points; however, no policy establishes a consistent economic advantage over the 26-week horizon under the assumed costs. Subsequent evaluations should validate quantile combinations on new datasets and periods, assess model selection using pre-test indicators of demand growth, extend the liquidation horizon, and test additional forecasting models under the same decision policy.</w:t>
+        <w:t>Quantile liquidation reduces inventory on VN1 while changing fill rate by at most 0.02 percentage points. Its economic value is not established under the assumed costs over 26 weeks. Useful next tests would use stock-availability records, longer liquidation horizons and more forecasting architectures under the same stock policy.</w:t>
       </w:r>
     </w:p>
     <w:p>
       <w:pPr>
         <w:pStyle w:val="Heading1"/>
+        <w:keepNext/>
       </w:pPr>
       <w:r>
         <w:t>REFERENCES</w:t>
@@ -13820,6 +15633,38 @@
       </w:pPr>
       <w:r>
         <w:t>[25]  M. Z. Babai, M. M. Ali, and K. Nikolopoulos. 2012. Impact of temporal aggregation on stock control performance of intermittent demand estimators: Empirical analysis. Omega 40, 713–721. https://doi.org/10.1016/j.omega.2011.09.004</w:t>
+      </w:r>
+    </w:p>
+    <w:p>
+      <w:pPr>
+        <w:pStyle w:val="Reference"/>
+      </w:pPr>
+      <w:r>
+        <w:t>[26]  C. Challu, K. G. Olivares, B. N. Oreshkin, F. Garza, M. Mergenthaler-Canseco, and A. Dubrawski. 2023. N-HiTS: Neural hierarchical interpolation for time series forecasting. In Proceedings of the AAAI Conference on Artificial Intelligence 37, 6. https://doi.org/10.1609/aaai.v37i6.25854</w:t>
+      </w:r>
+    </w:p>
+    <w:p>
+      <w:pPr>
+        <w:pStyle w:val="Reference"/>
+      </w:pPr>
+      <w:r>
+        <w:t>[27]  O. M. Nabil, N. H. Afia, and T. Ismail. 2026. Intermittent demand forecasting for spare parts using classification/regression models of machine learning and deep learning. Ain Shams Engineering Journal 17, 104445. https://doi.org/10.1016/j.asej.2026.104445</w:t>
+      </w:r>
+    </w:p>
+    <w:p>
+      <w:pPr>
+        <w:pStyle w:val="Reference"/>
+      </w:pPr>
+      <w:r>
+        <w:t>[28]  S. Nahmias. 1994. Demand estimation in lost sales inventory systems. Naval Research Logistics 41, 6, 739–757. https://doi.org/10.1002/1520-6750(199410)41:6&lt;739::AID-NAV3220410605&gt;3.0.CO;2-A</w:t>
+      </w:r>
+    </w:p>
+    <w:p>
+      <w:pPr>
+        <w:pStyle w:val="Reference"/>
+      </w:pPr>
+      <w:r>
+        <w:t>[29]  J. L. Powell. 1986. Censored regression quantiles. Journal of Econometrics 32, 1, 143–155. https://doi.org/10.1016/0304-4076(86)90016-3</w:t>
       </w:r>
     </w:p>
     <w:sectPr>

</xml_diff>

<commit_message>
paper: ACM conventions in the final file (reference line with venue, dates and length; colon captions); compensating trims (10 pages)
</commit_message>
<xml_diff>
--- a/08_final_submission/ICIIT2027_Paper.docx
+++ b/08_final_submission/ICIIT2027_Paper.docx
@@ -140,7 +140,7 @@
         <w:pStyle w:val="SmallNote"/>
       </w:pPr>
       <w:r>
-        <w:t>ACM Reference Format: Duy Anh Bui, Huy Gia Tran Khong, Huong Cam Thi Nguyen, and Long Truong. 2027. Beyond Forecast Accuracy: Comparing Probabilistic Demand Forecasts by the Inventory They Require across Retail Settings and Periods. In Proceedings of the 12th International Conference on Intelligent Information Technology (ICIIT 2027). ACM, New York, NY, USA.</w:t>
+        <w:t>ACM Reference Format: Duy Anh Bui, Huy Gia Tran Khong, Huong Cam Thi Nguyen, and Long Truong. 2027. Beyond Forecast Accuracy: Comparing Probabilistic Demand Forecasts by the Inventory They Require across Retail Settings and Periods. In Proceedings of the 12th International Conference on Intelligent Information Technology (ICIIT 2027), March 4–7, 2027, Ho Chi Minh City, Vietnam. ACM, New York, NY, USA, 10 pages.</w:t>
       </w:r>
     </w:p>
     <w:p>
@@ -293,7 +293,7 @@
         <w:spacing w:before="80" w:after="60"/>
       </w:pPr>
       <w:r>
-        <w:t>Table 1. Dataset characteristics measured before the main test window.</w:t>
+        <w:t>Table 1: Dataset characteristics measured before the main test window.</w:t>
       </w:r>
     </w:p>
     <w:tbl>
@@ -1145,7 +1145,7 @@
         <w:spacing w:before="80" w:after="60"/>
       </w:pPr>
       <w:r>
-        <w:t>Table 2. Three-week forecast accuracy, by dataset and window. Lower values indicate better performance; wQL is volume-weighted quantile loss.</w:t>
+        <w:t>Table 2: Three-week forecast accuracy, by dataset and window. Lower values indicate better performance; wQL is volume-weighted quantile loss.</w:t>
       </w:r>
     </w:p>
     <w:tbl>
@@ -5733,7 +5733,7 @@
         <w:spacing w:before="80" w:after="60"/>
       </w:pPr>
       <w:r>
-        <w:t>Figure 1. Inventory in weeks of demand against realised fill rate in the main window: (a) M5, (b) VN1. τ ranges from 0.50 to 0.99; solid curves represent direct quantile methods.</w:t>
+        <w:t>Figure 1: Inventory in weeks of demand against realised fill rate in the main window: (a) M5, (b) VN1. τ ranges from 0.50 to 0.99; solid curves represent direct quantile methods.</w:t>
       </w:r>
     </w:p>
     <w:p>
@@ -5743,7 +5743,7 @@
         <w:spacing w:before="80" w:after="60"/>
       </w:pPr>
       <w:r>
-        <w:t>Table 3. Inventory needed for fill rate 0.94. Δ = I_method / I_LGB-Q − 1 (%); positive values favour LGB-Q. Brackets show 95% bootstrap intervals; “—” means the method did not reach 0.94.</w:t>
+        <w:t>Table 3: Inventory needed for fill rate 0.94. Δ = I_method / I_LGB-Q − 1 (%); positive values favour LGB-Q. Brackets show 95% bootstrap intervals; “—” means the method did not reach 0.94.</w:t>
       </w:r>
     </w:p>
     <w:tbl>
@@ -7664,7 +7664,7 @@
         <w:spacing w:before="80" w:after="60"/>
       </w:pPr>
       <w:r>
-        <w:t>Table 4. Demand groups defined retrospectively from test-period demand relative to the preceding 26 weeks (stable: 0.67–1.50×; growing: &gt;1.50×). Δ compares TSB-NB inventory with LGB-Q at fill rate 0.92.</w:t>
+        <w:t>Table 4: Demand groups defined retrospectively from test-period demand relative to the preceding 26 weeks (stable: 0.67–1.50×; growing: &gt;1.50×). Δ compares TSB-NB inventory with LGB-Q at fill rate 0.92.</w:t>
       </w:r>
     </w:p>
     <w:tbl>
@@ -8809,7 +8809,7 @@
         <w:spacing w:before="80" w:after="60"/>
       </w:pPr>
       <w:r>
-        <w:t>Table 5. Selection rules trained on one window and evaluated on the next. Numbers are inventory changes (%) relative to always using LGB-Q at fill rate 0.94; negatives favour the rule. Brackets give 95% bootstrap intervals.</w:t>
+        <w:t>Table 5: Selection rules trained on one window and evaluated on the next. Numbers are inventory changes (%) relative to always using LGB-Q at fill rate 0.94; negatives favour the rule. Brackets give 95% bootstrap intervals.</w:t>
       </w:r>
     </w:p>
     <w:tbl>
@@ -9849,7 +9849,7 @@
         <w:spacing w:before="80" w:after="60"/>
       </w:pPr>
       <w:r>
-        <w:t>Table 6. Changes relative to no liquidation when LGB-Q supplies the forecasts. Break-even salvage ratios s* are calculated under the specified holding-cost and markup assumptions.</w:t>
+        <w:t>Table 6: Changes relative to no liquidation when LGB-Q supplies the forecasts. Break-even salvage ratios s* are calculated under the specified holding-cost and markup assumptions.</w:t>
       </w:r>
     </w:p>
     <w:tbl>
@@ -13805,7 +13805,7 @@
         <w:widowControl/>
       </w:pPr>
       <w:r>
-        <w:t>Neural baseline. We evaluated a univariate N-HiTS network [26] separately from the seven-method benchmark. It predicts quantiles of cumulative h-week demand with a multi-quantile loss, is refitted every 13 weeks and uses fixed hyperparameters. It never leads on inventory. At fill rates of 0.90–0.94 on M5 it needs 2.6–10.0% more stock than LGB-Q; its frontier ranks on VN1, among eight single methods, range from 2.8 to 4.4. It is a CPU-budgeted baseline, not evidence about deep learning as a class.</w:t>
+        <w:t>Neural baseline. We evaluated a univariate N-HiTS network [26] separately from the seven-method benchmark. It predicts h-week demand quantiles and is refitted every 13 weeks with fixed hyperparameters. It never leads on inventory. At fill rates of 0.90–0.94 on M5 it needs 2.6–10.0% more stock than LGB-Q; its frontier ranks on VN1, among eight single methods, range from 2.8 to 4.4. It is a CPU-budgeted baseline, not evidence about deep learning as a class.</w:t>
       </w:r>
     </w:p>
     <w:p>
@@ -13830,7 +13830,7 @@
         <w:widowControl/>
       </w:pPr>
       <w:r>
-        <w:t>Table 7. Past-only service calibration (τ updated weekly, η = 0.5); target fill 0.92 throughout, Fill = achieved fill. ΔI = inventory relative to LGB-Q (%), 95% full-policy cluster-bootstrap intervals (τ path recomputed per replicate; M5 items, VN1 warehouses, footwear styles); LGB-Q rows: weeks of demand. † = fills differ by ≥ 0.5 points, not like-for-like.</w:t>
+        <w:t>Table 7: Past-only service calibration (τ updated weekly, η = 0.5); target fill 0.92 throughout, Fill = achieved fill. ΔI = inventory relative to LGB-Q (%), 95% full-policy cluster-bootstrap intervals (τ path recomputed per replicate; M5 items, VN1 warehouses, footwear styles); LGB-Q rows: weeks of demand. † = fills differ by ≥ 0.5 points, not like-for-like.</w:t>
       </w:r>
     </w:p>
     <w:tbl>
@@ -15342,7 +15342,7 @@
         <w:widowControl/>
       </w:pPr>
       <w:r>
-        <w:t>On VN1, the retrospective demand split helps describe these reversals. TSB-NB uses less stock for stable-demand series, whereas LGB-Q reaches fill rate 0.92 on growing-demand series in two windows where TSB-NB cannot. Theodorou et al. [7] similarly find cases in which forecast accuracy and inventory cost favour different methods, though under different service and cost settings. If future demand growth were known in advance, assigning LGB-Q to growing series and TSB-NB to the rest would reduce inventory by 5.6–9.8% relative to LGB-Q on VN1. At warehouse level, pre-test features carry some information on the reversals: fitted on an earlier window, they rank the TSB-NB/LGB-Q inventory ratio of the next window with Spearman ρ of 0.21–0.27 (permutation p ≤ 0.046), but assigning TSB-NB to the warehouses they favour changes VN1 inventory by −9.4%, −0.2% and +2.9% across three train–test splits, so the signal does not yield a reliable selection rule.</w:t>
+        <w:t>On VN1, the retrospective demand split helps describe these reversals. TSB-NB uses less stock for stable-demand series, whereas LGB-Q reaches fill rate 0.92 on growing-demand series in two windows where TSB-NB cannot. If future demand growth were known in advance, assigning LGB-Q to growing series and TSB-NB to the rest would reduce inventory by 5.6–9.8% relative to LGB-Q on VN1. At warehouse level, pre-test features carry some information on the reversals: fitted on an earlier window, they rank the TSB-NB/LGB-Q inventory ratio of the next window with Spearman ρ of 0.21–0.27 (permutation p ≤ 0.046), but assigning TSB-NB to the warehouses they favour changes VN1 inventory by −9.4%, −0.2% and +2.9% across three train–test splits, so the signal does not yield a reliable selection rule.</w:t>
       </w:r>
     </w:p>
     <w:p>
@@ -15374,7 +15374,7 @@
         <w:widowControl/>
       </w:pPr>
       <w:r>
-        <w:t>Toward deployment. Because neither combination showed a reliable advantage in Section 5.8, LGB-Q is the safer default, and retrospective savings alone do not justify a switch. A candidate should be frozen and run in shadow mode beside it for several review cycles, with achieved fill and upper-quantile coverage monitored, where TSB-NB under-covers.</w:t>
+        <w:t>Toward deployment. Because neither combination showed a reliable advantage in Section 5.8, LGB-Q is the safer default, and retrospective savings alone do not justify a switch. A frozen candidate should first run in shadow mode beside it, with achieved fill and upper-quantile coverage monitored.</w:t>
       </w:r>
     </w:p>
     <w:p>
@@ -15390,7 +15390,7 @@
         <w:widowControl/>
       </w:pPr>
       <w:r>
-        <w:t>Limitations. Recorded sales stand in for demand, and stockouts are only inferred (see above). We did not tune hyperparameters; the M5 comparison persists across four LightGBM settings, but VN1 is sensitive to one of them (Section 5.8). Growth groups are formed retrospectively. Series-level intervals are too narrow on VN1, where warehouse- and client-level resampling widens them (Section 5.8), and M5 and VN1 supply three evaluation windows, the footwear panel one. Chronos-2 [22] ran zero-shot only. Nabil et al. [27] forecast spare-part demand with a two-stage LightGBM/XGBoost model (an occurrence classifier times a size regressor) and set stock with a normal safety factor; a quantile version of this design is not tested here.</w:t>
+        <w:t>Limitations. Recorded sales stand in for demand, and stockouts are only inferred (see above). We did not tune hyperparameters; the M5 comparison persists across four LightGBM settings, but VN1 is sensitive to one of them (Section 5.8). Growth groups are formed retrospectively. Series-level intervals are too narrow on VN1, where warehouse- and client-level resampling widens them (Section 5.8), and M5 and VN1 supply three evaluation windows, the footwear panel one. Nabil et al. [27] forecast spare-part demand with a two-stage LightGBM/XGBoost model (an occurrence classifier times a size regressor) and set stock with a normal safety factor; a quantile version of this design is not tested here.</w:t>
       </w:r>
     </w:p>
     <w:p>
@@ -15423,7 +15423,7 @@
         <w:widowControl/>
       </w:pPr>
       <w:r>
-        <w:t>Quantile liquidation reduces inventory on VN1 while changing fill rate by at most 0.02 percentage points. Its economic value is not established under the assumed costs over 26 weeks. Useful next tests would use stock-availability records, longer liquidation horizons and more forecasting architectures under the same stock policy.</w:t>
+        <w:t>Quantile liquidation reduces VN1 inventory at a fill-rate cost of at most 0.02 points, but its economic value is not established under the assumed costs; stock-availability records and longer horizons are the next tests.</w:t>
       </w:r>
     </w:p>
     <w:p>

</xml_diff>

<commit_message>
Final paper: AI-use acknowledgment (ACM authorship policy), three keywords, small wording trims; 10 pages
</commit_message>
<xml_diff>
--- a/08_final_submission/ICIIT2027_Paper.docx
+++ b/08_final_submission/ICIIT2027_Paper.docx
@@ -132,7 +132,7 @@
         <w:pStyle w:val="SmallNote"/>
       </w:pPr>
       <w:r>
-        <w:t>Additional Keywords and Phrases: probabilistic forecasting; inventory management; intermittent demand; quantile regression; demand segmentation; liquidation; M5; VN1</w:t>
+        <w:t>Additional Keywords and Phrases: probabilistic forecasting; inventory management; intermittent demand</w:t>
       </w:r>
     </w:p>
     <w:p>
@@ -15734,7 +15734,7 @@
         <w:widowControl/>
       </w:pPr>
       <w:r>
-        <w:t>Adaptive updating. Parameters are re-estimated only every 13 weeks with fixed hyperparameters, which can leave the global models a block behind level shifts on fast-growing VN1 series. More frequent refits or recency weighting could reduce that lag but were not tested.</w:t>
+        <w:t>Adaptive updating. Parameters are re-estimated only every 13 weeks with fixed hyperparameters, which can leave global models behind level shifts on fast-growing VN1 series. More frequent refits or recency weighting were not tested.</w:t>
       </w:r>
     </w:p>
     <w:p>
@@ -15742,7 +15742,7 @@
         <w:widowControl/>
       </w:pPr>
       <w:r>
-        <w:t>How the quantiles are constructed also matters: on M5 at fill rate 0.94, LGB-T and LGB-C need 3.3–8.2% more inventory than directly estimated LightGBM quantiles. Different quantile construction may explain part of the disagreement with [7] and [23].</w:t>
+        <w:t>How the quantiles are constructed also matters: on M5 at fill rate 0.94, LGB-T and LGB-C need 3.3–8.2% more inventory than directly estimated LightGBM quantiles. This may explain part of the disagreement with [7, 23].</w:t>
       </w:r>
     </w:p>
     <w:p>
@@ -15758,7 +15758,7 @@
         <w:widowControl/>
       </w:pPr>
       <w:r>
-        <w:t>Toward deployment. Because neither combination showed a reliable advantage in Section 5.8, LGB-Q is the safer default, and retrospective savings alone do not justify a switch. A frozen candidate should first run in shadow mode beside it, with achieved fill and upper-quantile coverage monitored.</w:t>
+        <w:t>Toward deployment. Because neither combination showed a reliable advantage in Section 5.8, LGB-Q is the safer default. A frozen candidate should first run in shadow mode beside it, with achieved fill and upper-quantile coverage monitored.</w:t>
       </w:r>
     </w:p>
     <w:p>
@@ -15766,7 +15766,7 @@
         <w:widowControl/>
       </w:pPr>
       <w:r>
-        <w:t>Censored demand. Both datasets record sales, not demand, and contain no on-hand records. A sales-only detector that flags zero runs between two sales whose probability under the series' sale frequency p is below 1% ((1 − p)^k &lt; 0.01) marks 7.4–9.0% of M5 and 6.1–6.9% of VN1 test weeks as suspected stockouts; because genuine pauses in demand are also flagged, these are upper bounds. Restricting the evaluation to the 72–82% of series without flagged weeks leaves the leading method of every window and C2's lowest maximum regret unchanged. A stricter scenario imputes each series' mean weekly sales in every flagged week. TSB-NB, whose occurrence probability falls during zero runs, then needs 17–27% more inventory than LGB-Q on M5 at fill rate 0.92; the leading method changes in three of six windows, always to a closely ranked method; and C2's maximum regret rises to 9.8%, although it still needs 6.9–10.7% less inventory than LGB-Q on VN1. The pre-specified E7-med is less sensitive: its maximum regret is 0.1% on the clean subset and −2.2% under imputation, where it needs 2.9–5.6% less M5 and 9.5–14.7% less VN1 inventory than LGB-Q at fill rate 0.92. Across detector thresholds of 0.001–0.1 and imputing half the mean, the mean or the mean positive sales, TSB-NB needs 11.8–34.2% more inventory than LGB-Q on M5, while E7-med needs 1.4–7.2% (M5) and 8.2–15.9% (VN1) less and keeps a maximum regret of at most 1.6%. Stock-availability records would be needed to settle these effects. Censoring could also be handled in training, with a censored likelihood [28] or censored quantile regression [29]; we leave this to future work.</w:t>
+        <w:t>Censored demand. Both datasets record sales, not demand, and contain no on-hand records. A sales-only detector that flags zero runs between two sales whose probability under the series' sale frequency p is below 1% ((1 − p)^k &lt; 0.01) marks 7.4–9.0% of M5 and 6.1–6.9% of VN1 test weeks as suspected stockouts; because genuine pauses in demand are also flagged, these are upper bounds. Restricting the evaluation to the 72–82% of series without flagged weeks leaves the leading method of every window and C2's lowest maximum regret unchanged. A stricter scenario imputes each series' mean weekly sales in every flagged week. TSB-NB, whose occurrence probability falls during zero runs, then needs 17–27% more inventory than LGB-Q on M5 at fill rate 0.92; the leading method changes in three of six windows, always to a closely ranked method; and C2's maximum regret rises to 9.8%, although it still needs 6.9–10.7% less inventory than LGB-Q on VN1. The pre-specified E7-med is less sensitive: its maximum regret is 0.1% on the clean subset and −2.2% under imputation, where it needs 2.9–5.6% less M5 and 9.5–14.7% less VN1 inventory than LGB-Q at fill rate 0.92. Across detector thresholds of 0.001–0.1 and imputing half the mean, the mean or the mean positive sales, TSB-NB needs 11.8–34.2% more inventory than LGB-Q on M5, while E7-med needs 1.4–7.2% (M5) and 8.2–15.9% (VN1) less and keeps a maximum regret of at most 1.6%. Censoring could also be handled in training, with a censored likelihood [28] or censored quantile regression [29]; we leave this to future work.</w:t>
       </w:r>
     </w:p>
     <w:p>
@@ -15774,7 +15774,7 @@
         <w:widowControl/>
       </w:pPr>
       <w:r>
-        <w:t>Limitations. Recorded sales stand in for demand, and stockouts are only inferred (see above). We did not tune hyperparameters; the M5 comparison persists across four LightGBM settings, but VN1 is sensitive to one of them (Section 5.8). Growth groups are formed retrospectively. Series-level intervals are too narrow on VN1, where warehouse- and client-level resampling widens them (Section 5.8), and M5 and VN1 supply three evaluation windows, the footwear panel one. A quantile version of the two-stage occurrence-times-size LightGBM/XGBoost model of Nabil et al. [27] is not tested here.</w:t>
+        <w:t>Limitations. Recorded sales stand in for demand, and stockouts are only inferred (see above). We did not tune hyperparameters; the M5 comparison persists across four LightGBM settings, but VN1 is sensitive to one of them (Section 5.8). Growth groups are formed retrospectively. Series-level intervals are too narrow on VN1, where warehouse- and client-level resampling widens them (Section 5.8), and M5 and VN1 supply three evaluation windows, the footwear panel one. A quantile version of the two-stage LightGBM/XGBoost model of Nabil et al. [27] is untested.</w:t>
       </w:r>
     </w:p>
     <w:p>
@@ -15808,6 +15808,14 @@
       </w:pPr>
       <w:r>
         <w:t>Quantile liquidation reduces VN1 inventory at a fill-rate cost of at most 0.02 points, but its economic value is not established under the assumed costs; stock-availability records and longer horizons are the next tests.</w:t>
+      </w:r>
+    </w:p>
+    <w:p>
+      <w:pPr>
+        <w:widowControl/>
+      </w:pPr>
+      <w:r>
+        <w:t>Acknowledgments. The authors used an AI assistant for language editing and code support; all analyses, results and conclusions were checked by the authors, who take full responsibility for the content.</w:t>
       </w:r>
     </w:p>
     <w:p>

</xml_diff>

<commit_message>
Final paper: explain negative regret, mark retrospective matched-fill bootstraps, fix two phrasings; 10 pages
</commit_message>
<xml_diff>
--- a/08_final_submission/ICIIT2027_Paper.docx
+++ b/08_final_submission/ICIIT2027_Paper.docx
@@ -299,7 +299,7 @@
         <w:widowControl/>
       </w:pPr>
       <w:r>
-        <w:t>Independent panel. To check the combinations on data not used to specify them, we add the retail-channel sales of a Vietnamese footwear chain, public on Kaggle (tienanh2003/sales-and-inventory-snapshot-data): 1,001 style–colour series over 82 weeks (January 2022 to July 2023), excluding returns and three partial weeks. With the eligibility rule above, 909 series enter one 26-week test window from 30 January 2023. Forecasts use the same pipeline, 21 features, refit schedule and policy; rerunning it on the processed sales file reproduces them exactly. Only one window fits the short history, month-end stock snapshots are unused, and single-method results on this panel existed before, but were not used for, specifying the combinations.</w:t>
+        <w:t>Independent panel. To check the combinations on data not used to specify them, we add the retail-channel sales of a Vietnamese footwear chain, public on Kaggle (tienanh2003/sales-and-inventory-snapshot-data): 1,001 style–colour series over 82 weeks (January 2022 to July 2023), excluding returns and three partial weeks. With the eligibility rule above, 909 series enter one 26-week test window from 30 January 2023. Forecasts use the same pipeline, 21 features, refit schedule and policy; rerunning it on the processed sales file reproduces them exactly. Only one window fits the short history, month-end stock snapshots are unused, and single-method results on this panel existed before but were not used to specify the combinations.</w:t>
       </w:r>
     </w:p>
     <w:p>
@@ -14086,7 +14086,7 @@
         <w:widowControl/>
       </w:pPr>
       <w:r>
-        <w:t>Hyperparameters. Refitting LGB-Q and LGB-T for h = 3 in the main window with small (15 leaves), large (255) and regularised (31 leaves, at least 500 samples per leaf, L2 penalty 10) trees leaves LGB-Q 4.7–6.8% below LGB-T and 7.5–11.0% below TSB-NB in inventory on M5 at fill rate 0.92, with its own inventory changing by less than 3%. The VN1 ranking persists for three settings; with small trees LGB-T uses 8.9% less inventory than LGB-Q.</w:t>
+        <w:t>Hyperparameters. When LGB-Q and LGB-T are refitted for h = 3 in the main window with small (15 leaves), large (255) and regularised (31 leaves, at least 500 samples per leaf, L2 penalty 10) trees, LGB-Q stays 4.7–6.8% below LGB-T and 7.5–11.0% below TSB-NB in inventory on M5 at fill rate 0.92, with its own inventory changing by less than 3%. The VN1 ranking persists for three settings; with small trees LGB-T uses 8.9% less inventory than LGB-Q.</w:t>
       </w:r>
     </w:p>
     <w:p>
@@ -14118,7 +14118,7 @@
         <w:widowControl/>
       </w:pPr>
       <w:r>
-        <w:t>Prospective τ, resampling and a third dataset. Choosing each method's τ on the previous window puts every method except EMP within 0.8 points of the target fill on M5, where LGB-T, LGB-C, TSB-NB and ETS then need 3.8–14.2% more inventory than LGB-Q. On VN1 the realised fill misses the target by up to 4.6 points for LGB-Q, HGB-Q, C2 and E7-med; updating τ every week by half the gap between the target and the fill realised so far reduces the miss to 2.4 points, above our one-point criterion. Table 7 separates the target (0.92) from the achieved fill (0.906–0.926 on M5, 0.906–0.940 on VN1, 0.865–0.893 on the footwear panel); LGB-Q meets the target within 0.5 points in one of five cases. Its intervals rerun the past-only policy, τ path included, in 2,000 paired cluster replicates and are wider than with τ held fixed, most on VN1. Of the 13 comparisons whose achieved fills are within 0.5 points of LGB-Q's (none on the footwear panel), one shows a significant saving (C2 on VN1, 7.4%), five need significantly more stock and seven are inconclusive; with thresholds of 0.25 or 1.0 points, 10 or 17 qualify and one or two show a saving. No method is therefore shown to beat LGB-Q where service differs. Resampling items, stores or blocks of weeks leaves every M5 interval claim intact, whereas for the matched-fill comparisons warehouse- or client-level resampling leaves only the second-window VN1 savings significant.</w:t>
+        <w:t>Prospective τ, resampling and a third dataset. Choosing each method's τ on the previous window puts every method except EMP within 0.8 points of the target fill on M5, where LGB-T, LGB-C, TSB-NB and ETS then need 3.8–14.2% more inventory than LGB-Q. On VN1 the realised fill misses the target by up to 4.6 points for LGB-Q, HGB-Q, C2 and E7-med; updating τ every week by half the gap between the target and the fill realised so far reduces the miss to 2.4 points, above our one-point criterion. Table 7 separates the target (0.92) from the achieved fill (0.906–0.926 on M5, 0.906–0.940 on VN1, 0.865–0.893 on the footwear panel); LGB-Q meets the target within 0.5 points in one of five cases. Its intervals rerun the past-only policy, τ path included, in 2,000 paired cluster replicates and are wider than with τ held fixed, most on VN1. Of the 13 comparisons whose achieved fills are within 0.5 points of LGB-Q's (none on the footwear panel), one shows a significant saving (C2 on VN1, 7.4%), five need significantly more stock and seven are inconclusive; with thresholds of 0.25 or 1.0 points, 10 or 17 qualify and one or two show a saving. No method is therefore shown to beat LGB-Q where service differs. Resampling items, stores or blocks of weeks leaves every M5 interval claim intact, whereas for the retrospective matched-fill comparisons warehouse- or client-level resampling leaves only the second-window VN1 savings significant.</w:t>
       </w:r>
     </w:p>
     <w:p>
@@ -15766,7 +15766,7 @@
         <w:widowControl/>
       </w:pPr>
       <w:r>
-        <w:t>Censored demand. Both datasets record sales, not demand, and contain no on-hand records. A sales-only detector that flags zero runs between two sales whose probability under the series' sale frequency p is below 1% ((1 − p)^k &lt; 0.01) marks 7.4–9.0% of M5 and 6.1–6.9% of VN1 test weeks as suspected stockouts; because genuine pauses in demand are also flagged, these are upper bounds. Restricting the evaluation to the 72–82% of series without flagged weeks leaves the leading method of every window and C2's lowest maximum regret unchanged. A stricter scenario imputes each series' mean weekly sales in every flagged week. TSB-NB, whose occurrence probability falls during zero runs, then needs 17–27% more inventory than LGB-Q on M5 at fill rate 0.92; the leading method changes in three of six windows, always to a closely ranked method; and C2's maximum regret rises to 9.8%, although it still needs 6.9–10.7% less inventory than LGB-Q on VN1. The pre-specified E7-med is less sensitive: its maximum regret is 0.1% on the clean subset and −2.2% under imputation, where it needs 2.9–5.6% less M5 and 9.5–14.7% less VN1 inventory than LGB-Q at fill rate 0.92. Across detector thresholds of 0.001–0.1 and imputing half the mean, the mean or the mean positive sales, TSB-NB needs 11.8–34.2% more inventory than LGB-Q on M5, while E7-med needs 1.4–7.2% (M5) and 8.2–15.9% (VN1) less and keeps a maximum regret of at most 1.6%. Censoring could also be handled in training, with a censored likelihood [28] or censored quantile regression [29]; we leave this to future work.</w:t>
+        <w:t>Censored demand. Both datasets record sales, not demand, and contain no on-hand records. A sales-only detector that flags zero runs between two sales whose probability under the series' sale frequency p is below 1% ((1 − p)^k &lt; 0.01) marks 7.4–9.0% of M5 and 6.1–6.9% of VN1 test weeks as suspected stockouts; because genuine pauses in demand are also flagged, these are upper bounds. Restricting the evaluation to the 72–82% of series without flagged weeks leaves the leading method of every window and C2's lowest maximum regret unchanged. A stricter scenario imputes each series' mean weekly sales in every flagged week. TSB-NB, whose occurrence probability falls during zero runs, then needs 17–27% more inventory than LGB-Q on M5 at fill rate 0.92; the leading method changes in three of six windows, always to a closely ranked method; and C2's maximum regret rises to 9.8%, although it still needs 6.9–10.7% less inventory than LGB-Q on VN1. The pre-specified E7-med is less sensitive: its maximum regret is 0.1% on the clean subset and −2.2% under imputation (negative: less stock than the best single method in every run), where it needs 2.9–5.6% less M5 and 9.5–14.7% less VN1 inventory than LGB-Q at fill rate 0.92. Across detector thresholds of 0.001–0.1 and imputing half the mean, the mean or the mean positive sales, TSB-NB needs 11.8–34.2% more inventory than LGB-Q on M5, while E7-med needs 1.4–7.2% (M5) and 8.2–15.9% (VN1) less and keeps a maximum regret of at most 1.6%. Censoring could also be handled in training, with a censored likelihood [28] or censored quantile regression [29]; we leave this to future work.</w:t>
       </w:r>
     </w:p>
     <w:p>

</xml_diff>